<commit_message>
Homework 4: reformat solutions with cover page and prose code explanation
Adds a cover page matching the Homework 3 report, switches to Times New
Roman with black headings, and rewrites Part III as a first-person program
explanation in the same style as Homework 3.

Co-Authored-By: Claude Opus 5.5 <noreply@anthropic.com>
Claude-Session: https://claude.ai/code/session_01ENZyqHAgTpUW2Q2njnQYSM
</commit_message>
<xml_diff>
--- a/homework/Homework_4/ENG6010_HW4_Solutions.docx
+++ b/homework/Homework_4/ENG6010_HW4_Solutions.docx
@@ -4,144 +4,82 @@
   <w:body>
     <w:p>
       <w:pPr>
-        <w:pStyle w:val="Title"/>
+        <w:spacing w:before="1200" w:after="480"/>
+        <w:jc w:val="center"/>
       </w:pPr>
       <w:r>
-        <w:t xml:space="preserve">ENG</w:t>
-      </w:r>
-      <w:r>
-        <w:t xml:space="preserve"> </w:t>
-      </w:r>
-      <w:r>
-        <w:t xml:space="preserve">6010:</w:t>
-      </w:r>
-      <w:r>
-        <w:t xml:space="preserve"> </w:t>
-      </w:r>
-      <w:r>
-        <w:t xml:space="preserve">AI</w:t>
-      </w:r>
-      <w:r>
-        <w:t xml:space="preserve"> </w:t>
-      </w:r>
-      <w:r>
-        <w:t xml:space="preserve">in</w:t>
-      </w:r>
-      <w:r>
-        <w:t xml:space="preserve"> </w:t>
-      </w:r>
-      <w:r>
-        <w:t xml:space="preserve">Robotics</w:t>
-      </w:r>
-      <w:r>
-        <w:t xml:space="preserve"> </w:t>
-      </w:r>
-      <w:r>
-        <w:t xml:space="preserve">—</w:t>
-      </w:r>
-      <w:r>
-        <w:t xml:space="preserve"> </w:t>
-      </w:r>
-      <w:r>
-        <w:t xml:space="preserve">Homework</w:t>
-      </w:r>
-      <w:r>
-        <w:t xml:space="preserve"> </w:t>
-      </w:r>
-      <w:r>
-        <w:t xml:space="preserve">4</w:t>
-      </w:r>
-      <w:r>
-        <w:t xml:space="preserve"> </w:t>
-      </w:r>
-      <w:r>
-        <w:t xml:space="preserve">Solutions</w:t>
+        <w:rPr>
+          <w:b/>
+          <w:bCs/>
+          <w:sz w:val="40"/>
+          <w:szCs w:val="40"/>
+        </w:rPr>
+        <w:t xml:space="preserve">Homework 4</w:t>
       </w:r>
     </w:p>
     <w:p>
       <w:pPr>
-        <w:pStyle w:val="Subtitle"/>
+        <w:spacing w:before="0" w:after="160"/>
+        <w:jc w:val="center"/>
       </w:pPr>
       <w:r>
-        <w:t xml:space="preserve">Deep</w:t>
-      </w:r>
-      <w:r>
-        <w:t xml:space="preserve"> </w:t>
-      </w:r>
-      <w:r>
-        <w:t xml:space="preserve">Learning,</w:t>
-      </w:r>
-      <w:r>
-        <w:t xml:space="preserve"> </w:t>
-      </w:r>
-      <w:r>
-        <w:t xml:space="preserve">Convolutional</w:t>
-      </w:r>
-      <w:r>
-        <w:t xml:space="preserve"> </w:t>
-      </w:r>
-      <w:r>
-        <w:t xml:space="preserve">Neural</w:t>
-      </w:r>
-      <w:r>
-        <w:t xml:space="preserve"> </w:t>
-      </w:r>
-      <w:r>
-        <w:t xml:space="preserve">Networks</w:t>
-      </w:r>
-      <w:r>
-        <w:t xml:space="preserve"> </w:t>
-      </w:r>
-      <w:r>
-        <w:t xml:space="preserve">(CNNs)</w:t>
-      </w:r>
-      <w:r>
-        <w:t xml:space="preserve"> </w:t>
-      </w:r>
-      <w:r>
-        <w:t xml:space="preserve">&amp;</w:t>
-      </w:r>
-      <w:r>
-        <w:t xml:space="preserve"> </w:t>
-      </w:r>
-      <w:r>
-        <w:t xml:space="preserve">Architectures</w:t>
+        <w:rPr>
+          <w:sz w:val="24"/>
+          <w:szCs w:val="24"/>
+        </w:rPr>
+        <w:t xml:space="preserve">Artificial Intelligence in Robotics</w:t>
       </w:r>
     </w:p>
     <w:p>
       <w:pPr>
-        <w:pStyle w:val="FirstParagraph"/>
+        <w:spacing w:before="0" w:after="160"/>
+        <w:jc w:val="center"/>
       </w:pPr>
       <w:r>
         <w:rPr>
-          <w:bCs/>
-          <w:b/>
+          <w:sz w:val="24"/>
+          <w:szCs w:val="24"/>
         </w:rPr>
-        <w:t xml:space="preserve">Student Name:</w:t>
-      </w:r>
-      <w:r>
-        <w:t xml:space="preserve"> </w:t>
-      </w:r>
-      <w:r>
-        <w:t xml:space="preserve">________________________</w:t>
+        <w:t xml:space="preserve">ENGR 6010 - 01</w:t>
       </w:r>
     </w:p>
     <w:p>
       <w:pPr>
-        <w:pStyle w:val="BodyText"/>
+        <w:spacing w:before="7200" w:after="160"/>
       </w:pPr>
       <w:r>
         <w:rPr>
-          <w:bCs/>
-          <w:b/>
+          <w:sz w:val="24"/>
+          <w:szCs w:val="24"/>
         </w:rPr>
-        <w:t xml:space="preserve">Instructor:</w:t>
-      </w:r>
-      <w:r>
-        <w:t xml:space="preserve"> </w:t>
-      </w:r>
-      <w:r>
-        <w:t xml:space="preserve">Dr. Hongbo Zhang</w:t>
+        <w:t xml:space="preserve">Connor Jarrett</w:t>
+      </w:r>
+    </w:p>
+    <w:p>
+      <w:pPr>
+        <w:spacing w:before="0" w:after="160"/>
+      </w:pPr>
+      <w:r>
+        <w:rPr>
+          <w:sz w:val="24"/>
+          <w:szCs w:val="24"/>
+        </w:rPr>
+        <w:t xml:space="preserve">10/27/2026</w:t>
+      </w:r>
+    </w:p>
+    <w:p>
+      <w:pPr>
+        <w:spacing w:before="0" w:after="160"/>
+      </w:pPr>
+      <w:r>
+        <w:rPr>
+          <w:sz w:val="24"/>
+          <w:szCs w:val="24"/>
+        </w:rPr>
+        <w:t xml:space="preserve">Professor Hongbo Zhang</w:t>
+      </w:r>
+      <w:r>
+        <w:br w:type="page"/>
       </w:r>
     </w:p>
     <w:bookmarkStart w:id="24" w:name="X48a776e996e2b22e1780e887d2dc6974201e861"/>
@@ -246,7 +184,13 @@
         <w:t xml:space="preserve"> </w:t>
       </w:r>
       <w:r>
-        <w:t xml:space="preserve">filters of size</w:t>
+        <w:t xml:space="preserve">filters of</w:t>
+      </w:r>
+      <w:r>
+        <w:t xml:space="preserve"> </w:t>
+      </w:r>
+      <w:r>
+        <w:t xml:space="preserve">size</w:t>
       </w:r>
       <w:r>
         <w:t xml:space="preserve"> </w:t>
@@ -401,7 +345,10 @@
             <m:t>,</m:t>
           </m:r>
           <m:r>
-            <m:t>  </m:t>
+            <m:t> </m:t>
+          </m:r>
+          <m:r>
+            <m:t> </m:t>
           </m:r>
           <m:sSub>
             <m:e>
@@ -501,7 +448,10 @@
             <m:t>,</m:t>
           </m:r>
           <m:r>
-            <m:t>  </m:t>
+            <m:t> </m:t>
+          </m:r>
+          <m:r>
+            <m:t> </m:t>
           </m:r>
           <m:sSub>
             <m:e>
@@ -704,7 +654,13 @@
         <w:t xml:space="preserve"> </w:t>
       </w:r>
       <w:r>
-        <w:t xml:space="preserve">A conv filter uses the same weights at every spatial position, so the count above does not depend on</w:t>
+        <w:t xml:space="preserve">A conv filter uses the same</w:t>
+      </w:r>
+      <w:r>
+        <w:t xml:space="preserve"> </w:t>
+      </w:r>
+      <w:r>
+        <w:t xml:space="preserve">weights at every spatial position, so the count above does not depend on</w:t>
       </w:r>
       <w:r>
         <w:t xml:space="preserve"> </w:t>
@@ -753,7 +709,19 @@
         </m:sSub>
       </m:oMath>
       <w:r>
-        <w:t xml:space="preserve">. A fully connected layer mapping the same input to the same output volume needs a separate weight for every input–output pair:</w:t>
+        <w:t xml:space="preserve">. A fully connected layer mapping the same input to</w:t>
+      </w:r>
+      <w:r>
+        <w:t xml:space="preserve"> </w:t>
+      </w:r>
+      <w:r>
+        <w:t xml:space="preserve">the same output volume needs a separate weight for every input–output</w:t>
+      </w:r>
+      <w:r>
+        <w:t xml:space="preserve"> </w:t>
+      </w:r>
+      <w:r>
+        <w:t xml:space="preserve">pair:</w:t>
       </w:r>
     </w:p>
     <w:p>
@@ -1282,7 +1250,19 @@
         <w:t xml:space="preserve"> </w:t>
       </w:r>
       <w:r>
-        <w:t xml:space="preserve">parameters. Sharing also builds in translation equivariance: a feature detected in one place is detected anywhere.</w:t>
+        <w:t xml:space="preserve">parameters. Sharing also</w:t>
+      </w:r>
+      <w:r>
+        <w:t xml:space="preserve"> </w:t>
+      </w:r>
+      <w:r>
+        <w:t xml:space="preserve">builds in translation equivariance: a feature detected in one place is</w:t>
+      </w:r>
+      <w:r>
+        <w:t xml:space="preserve"> </w:t>
+      </w:r>
+      <w:r>
+        <w:t xml:space="preserve">detected anywhere.</w:t>
       </w:r>
     </w:p>
     <w:bookmarkEnd w:id="20"/>
@@ -1298,16 +1278,16 @@
     <w:tbl>
       <w:tblPr>
         <w:tblStyle w:val="Table"/>
-        <w:tblW w:type="pct" w:w="5000"/>
+        <w:tblW w:type="pct" w:w="4921"/>
         <w:tblLook w:firstRow="1" w:lastRow="0" w:firstColumn="0" w:lastColumn="0" w:noHBand="0" w:noVBand="0" w:val="0020"/>
         <w:jc w:val="start"/>
       </w:tblPr>
       <w:tblGrid>
-        <w:gridCol w:w="1584"/>
-        <w:gridCol w:w="1584"/>
-        <w:gridCol w:w="1584"/>
-        <w:gridCol w:w="1584"/>
-        <w:gridCol w:w="1584"/>
+        <w:gridCol w:w="942"/>
+        <w:gridCol w:w="2828"/>
+        <w:gridCol w:w="942"/>
+        <w:gridCol w:w="942"/>
+        <w:gridCol w:w="2137"/>
       </w:tblGrid>
       <w:tr>
         <w:trPr>
@@ -1515,7 +1495,13 @@
               <w:jc w:val="left"/>
             </w:pPr>
             <w:r>
-              <w:t xml:space="preserve">Saturates at both ends (</w:t>
+              <w:t xml:space="preserve">Saturates at both ends</w:t>
+            </w:r>
+            <w:r>
+              <w:t xml:space="preserve"> </w:t>
+            </w:r>
+            <w:r>
+              <w:t xml:space="preserve">(</w:t>
             </w:r>
             <m:oMath>
               <m:r>
@@ -1538,7 +1524,19 @@
               </m:r>
             </m:oMath>
             <w:r>
-              <w:t xml:space="preserve">); not zero-centered; gradient shrinks by at least 4× per layer</w:t>
+              <w:t xml:space="preserve">);</w:t>
+            </w:r>
+            <w:r>
+              <w:t xml:space="preserve"> </w:t>
+            </w:r>
+            <w:r>
+              <w:t xml:space="preserve">not zero-centered; gradient</w:t>
+            </w:r>
+            <w:r>
+              <w:t xml:space="preserve"> </w:t>
+            </w:r>
+            <w:r>
+              <w:t xml:space="preserve">shrinks by at least 4× per layer</w:t>
             </w:r>
           </w:p>
         </w:tc>
@@ -1697,27 +1695,31 @@
               <w:jc w:val="left"/>
             </w:pPr>
             <w:r>
-              <w:t xml:space="preserve">Zero-centered, but still saturates for large</w:t>
+              <w:t xml:space="preserve">Zero-centered, but still</w:t>
+            </w:r>
+            <w:r>
+              <w:t xml:space="preserve"> </w:t>
+            </w:r>
+            <w:r>
+              <w:t xml:space="preserve">saturates for large</w:t>
             </w:r>
             <w:r>
               <w:t xml:space="preserve"> </w:t>
             </w:r>
             <m:oMath>
-              <m:r>
-                <m:rPr>
-                  <m:sty m:val="p"/>
-                </m:rPr>
-                <m:t>|</m:t>
-              </m:r>
-              <m:r>
-                <m:t>z</m:t>
-              </m:r>
-              <m:r>
-                <m:rPr>
-                  <m:sty m:val="p"/>
-                </m:rPr>
-                <m:t>|</m:t>
-              </m:r>
+              <m:d>
+                <m:dPr>
+                  <m:begChr m:val="|"/>
+                  <m:endChr m:val="|"/>
+                  <m:sepChr m:val=""/>
+                  <m:grow/>
+                </m:dPr>
+                <m:e>
+                  <m:r>
+                    <m:t>z</m:t>
+                  </m:r>
+                </m:e>
+              </m:d>
             </m:oMath>
           </w:p>
         </w:tc>
@@ -1843,7 +1845,13 @@
               </m:r>
             </m:oMath>
             <w:r>
-              <w:t xml:space="preserve">, cheap, sparse; derivative is 0 for</w:t>
+              <w:t xml:space="preserve">, cheap,</w:t>
+            </w:r>
+            <w:r>
+              <w:t xml:space="preserve"> </w:t>
+            </w:r>
+            <w:r>
+              <w:t xml:space="preserve">sparse; derivative is 0 for</w:t>
             </w:r>
             <w:r>
               <w:t xml:space="preserve"> </w:t>
@@ -2356,7 +2364,25 @@
         <w:t xml:space="preserve"> </w:t>
       </w:r>
       <w:r>
-        <w:t xml:space="preserve">becomes negative for every input (often after a large update or a big negative bias), its output and gradient are both 0. Its weights never update again, so the neuron is permanently dead.</w:t>
+        <w:t xml:space="preserve">becomes</w:t>
+      </w:r>
+      <w:r>
+        <w:t xml:space="preserve"> </w:t>
+      </w:r>
+      <w:r>
+        <w:t xml:space="preserve">negative for every input (often after a large update or a big negative</w:t>
+      </w:r>
+      <w:r>
+        <w:t xml:space="preserve"> </w:t>
+      </w:r>
+      <w:r>
+        <w:t xml:space="preserve">bias), its output and gradient are both 0. Its weights never update</w:t>
+      </w:r>
+      <w:r>
+        <w:t xml:space="preserve"> </w:t>
+      </w:r>
+      <w:r>
+        <w:t xml:space="preserve">again, so the neuron is permanently dead.</w:t>
       </w:r>
       <w:r>
         <w:t xml:space="preserve"> </w:t>
@@ -2409,7 +2435,13 @@
         <w:t xml:space="preserve"> </w:t>
       </w:r>
       <w:r>
-        <w:t xml:space="preserve">instead of 0, so the weights keep receiving updates and the neuron can recover. (PReLU learns</w:t>
+        <w:t xml:space="preserve">instead of 0, so the weights keep</w:t>
+      </w:r>
+      <w:r>
+        <w:t xml:space="preserve"> </w:t>
+      </w:r>
+      <w:r>
+        <w:t xml:space="preserve">receiving updates and the neuron can recover. (PReLU learns</w:t>
       </w:r>
       <w:r>
         <w:t xml:space="preserve"> </w:t>
@@ -2420,7 +2452,13 @@
         </m:r>
       </m:oMath>
       <w:r>
-        <w:t xml:space="preserve">; ELU is a smooth alternative.)</w:t>
+        <w:t xml:space="preserve">;</w:t>
+      </w:r>
+      <w:r>
+        <w:t xml:space="preserve"> </w:t>
+      </w:r>
+      <w:r>
+        <w:t xml:space="preserve">ELU is a smooth alternative.)</w:t>
       </w:r>
     </w:p>
     <w:bookmarkEnd w:id="21"/>
@@ -2590,7 +2628,10 @@
             <m:t>,</m:t>
           </m:r>
           <m:r>
-            <m:t>  </m:t>
+            <m:t> </m:t>
+          </m:r>
+          <m:r>
+            <m:t> </m:t>
           </m:r>
           <m:r>
             <m:t>R</m:t>
@@ -2711,7 +2752,13 @@
         </m:r>
       </m:oMath>
       <w:r>
-        <w:t xml:space="preserve">. Layer 2 (</w:t>
+        <w:t xml:space="preserve">. Layer 2</w:t>
+      </w:r>
+      <w:r>
+        <w:t xml:space="preserve"> </w:t>
+      </w:r>
+      <w:r>
+        <w:t xml:space="preserve">(</w:t>
       </w:r>
       <m:oMath>
         <m:r>
@@ -2807,7 +2854,13 @@
         </m:r>
       </m:oMath>
       <w:r>
-        <w:t xml:space="preserve">. Intuitively, each output of layer 2 sees a</w:t>
+        <w:t xml:space="preserve">. Intuitively, each</w:t>
+      </w:r>
+      <w:r>
+        <w:t xml:space="preserve"> </w:t>
+      </w:r>
+      <w:r>
+        <w:t xml:space="preserve">output of layer 2 sees a</w:t>
       </w:r>
       <w:r>
         <w:t xml:space="preserve"> </w:t>
@@ -2830,7 +2883,19 @@
         <w:t xml:space="preserve"> </w:t>
       </w:r>
       <w:r>
-        <w:t xml:space="preserve">patch of layer-1 outputs; adjacent layer-1 outputs are offset by one pixel and each sees 3 pixels, so the patch spans</w:t>
+        <w:t xml:space="preserve">patch of layer-1 outputs; adjacent</w:t>
+      </w:r>
+      <w:r>
+        <w:t xml:space="preserve"> </w:t>
+      </w:r>
+      <w:r>
+        <w:t xml:space="preserve">layer-1 outputs are offset by one pixel and each sees 3 pixels, so the</w:t>
+      </w:r>
+      <w:r>
+        <w:t xml:space="preserve"> </w:t>
+      </w:r>
+      <w:r>
+        <w:t xml:space="preserve">patch spans</w:t>
       </w:r>
       <w:r>
         <w:t xml:space="preserve"> </w:t>
@@ -3081,7 +3146,10 @@
             <m:t>,</m:t>
           </m:r>
           <m:r>
-            <m:t>  </m:t>
+            <m:t> </m:t>
+          </m:r>
+          <m:r>
+            <m:t> </m:t>
           </m:r>
           <m:r>
             <m:rPr>
@@ -3300,7 +3368,13 @@
         <w:pStyle w:val="FirstParagraph"/>
       </w:pPr>
       <w:r>
-        <w:t xml:space="preserve">The stacked version also adds a second non-linearity, making the function more expressive. ∎</w:t>
+        <w:t xml:space="preserve">The stacked version also adds a second non-linearity, making the</w:t>
+      </w:r>
+      <w:r>
+        <w:t xml:space="preserve"> </w:t>
+      </w:r>
+      <w:r>
+        <w:t xml:space="preserve">function more expressive. ∎</w:t>
       </w:r>
     </w:p>
     <w:bookmarkEnd w:id="22"/>
@@ -3394,7 +3468,13 @@
         </m:r>
       </m:oMath>
       <w:r>
-        <w:t xml:space="preserve">. By the chain rule:</w:t>
+        <w:t xml:space="preserve">. By</w:t>
+      </w:r>
+      <w:r>
+        <w:t xml:space="preserve"> </w:t>
+      </w:r>
+      <w:r>
+        <w:t xml:space="preserve">the chain rule:</w:t>
       </w:r>
     </w:p>
     <w:p>
@@ -3806,7 +3886,13 @@
         </m:d>
       </m:oMath>
       <w:r>
-        <w:t xml:space="preserve">. Unrolling from block</w:t>
+        <w:t xml:space="preserve">. Unrolling from</w:t>
+      </w:r>
+      <w:r>
+        <w:t xml:space="preserve"> </w:t>
+      </w:r>
+      <w:r>
+        <w:t xml:space="preserve">block</w:t>
       </w:r>
       <w:r>
         <w:t xml:space="preserve"> </w:t>
@@ -4209,7 +4295,13 @@
         <w:t xml:space="preserve"> </w:t>
       </w:r>
       <w:r>
-        <w:t xml:space="preserve">In a plain network the gradient is a product of</w:t>
+        <w:t xml:space="preserve">In a plain network the gradient is a</w:t>
+      </w:r>
+      <w:r>
+        <w:t xml:space="preserve"> </w:t>
+      </w:r>
+      <w:r>
+        <w:t xml:space="preserve">product of</w:t>
       </w:r>
       <w:r>
         <w:t xml:space="preserve"> </w:t>
@@ -4430,7 +4522,13 @@
         <w:pStyle w:val="FirstParagraph"/>
       </w:pPr>
       <w:r>
-        <w:t xml:space="preserve">If each factor is below 1 (for example at most 0.25 with sigmoid), the product shrinks exponentially with depth. In the residual form, the term</w:t>
+        <w:t xml:space="preserve">If each factor is below 1 (for example at most 0.25 with sigmoid), the</w:t>
+      </w:r>
+      <w:r>
+        <w:t xml:space="preserve"> </w:t>
+      </w:r>
+      <w:r>
+        <w:t xml:space="preserve">product shrinks exponentially with depth. In the residual form, the term</w:t>
       </w:r>
       <w:r>
         <w:t xml:space="preserve"> </w:t>
@@ -4490,7 +4588,37 @@
         <w:t xml:space="preserve"> </w:t>
       </w:r>
       <w:r>
-        <w:t xml:space="preserve">through the identity path, added rather than multiplied. For the whole bracket to be 0, the summed residual gradients would have to equal exactly −1 for every sample, which is extremely unlikely. So even very deep layers receive a direct, undiminished gradient signal, and weights near the input keep learning.</w:t>
+        <w:t xml:space="preserve">through the</w:t>
+      </w:r>
+      <w:r>
+        <w:t xml:space="preserve"> </w:t>
+      </w:r>
+      <w:r>
+        <w:t xml:space="preserve">identity path, added rather than multiplied. For the whole bracket to be</w:t>
+      </w:r>
+      <w:r>
+        <w:t xml:space="preserve"> </w:t>
+      </w:r>
+      <w:r>
+        <w:t xml:space="preserve">0, the summed residual gradients would have to equal exactly −1 for</w:t>
+      </w:r>
+      <w:r>
+        <w:t xml:space="preserve"> </w:t>
+      </w:r>
+      <w:r>
+        <w:t xml:space="preserve">every sample, which is extremely unlikely. So even very deep layers</w:t>
+      </w:r>
+      <w:r>
+        <w:t xml:space="preserve"> </w:t>
+      </w:r>
+      <w:r>
+        <w:t xml:space="preserve">receive a direct, undiminished gradient signal, and weights near the</w:t>
+      </w:r>
+      <w:r>
+        <w:t xml:space="preserve"> </w:t>
+      </w:r>
+      <w:r>
+        <w:t xml:space="preserve">input keep learning.</w:t>
       </w:r>
     </w:p>
     <w:bookmarkEnd w:id="23"/>
@@ -4618,7 +4746,19 @@
         </m:r>
       </m:oMath>
       <w:r>
-        <w:t xml:space="preserve">. Following the deep-learning convention (cross-correlation, kernel not flipped), each output is the element-wise product of</w:t>
+        <w:t xml:space="preserve">. Following</w:t>
+      </w:r>
+      <w:r>
+        <w:t xml:space="preserve"> </w:t>
+      </w:r>
+      <w:r>
+        <w:t xml:space="preserve">the deep-learning convention (cross-correlation, kernel not flipped),</w:t>
+      </w:r>
+      <w:r>
+        <w:t xml:space="preserve"> </w:t>
+      </w:r>
+      <w:r>
+        <w:t xml:space="preserve">each output is the element-wise product of</w:t>
       </w:r>
       <w:r>
         <w:t xml:space="preserve"> </w:t>
@@ -4678,34 +4818,42 @@
           </m:rPr>
           <m:t>−</m:t>
         </m:r>
-        <m:d>
-          <m:dPr>
-            <m:begChr m:val="["/>
-            <m:endChr m:val="]"/>
-            <m:sepChr m:val=""/>
-            <m:grow/>
-          </m:dPr>
-          <m:e>
-            <m:r>
-              <m:t>1</m:t>
-            </m:r>
-            <m:r>
-              <m:t> </m:t>
-            </m:r>
-            <m:r>
-              <m:t>2</m:t>
-            </m:r>
-            <m:r>
-              <m:t> </m:t>
-            </m:r>
-            <m:r>
-              <m:t>1</m:t>
-            </m:r>
-          </m:e>
-        </m:d>
+        <m:r>
+          <m:rPr>
+            <m:sty m:val="p"/>
+          </m:rPr>
+          <m:t>[</m:t>
+        </m:r>
+        <m:r>
+          <m:t>1</m:t>
+        </m:r>
+        <m:r>
+          <m:t> </m:t>
+        </m:r>
+        <m:r>
+          <m:t>2</m:t>
+        </m:r>
+        <m:r>
+          <m:t> </m:t>
+        </m:r>
+        <m:r>
+          <m:t>1</m:t>
+        </m:r>
+        <m:r>
+          <m:rPr>
+            <m:sty m:val="p"/>
+          </m:rPr>
+          <m:t>]</m:t>
+        </m:r>
       </m:oMath>
       <w:r>
-        <w:t xml:space="preserve">, its middle row 0 and its bottom row</w:t>
+        <w:t xml:space="preserve">, its middle row 0 and</w:t>
+      </w:r>
+      <w:r>
+        <w:t xml:space="preserve"> </w:t>
+      </w:r>
+      <w:r>
+        <w:t xml:space="preserve">its bottom row</w:t>
       </w:r>
       <w:r>
         <w:t xml:space="preserve"> </w:t>
@@ -4717,34 +4865,42 @@
           </m:rPr>
           <m:t>+</m:t>
         </m:r>
-        <m:d>
-          <m:dPr>
-            <m:begChr m:val="["/>
-            <m:endChr m:val="]"/>
-            <m:sepChr m:val=""/>
-            <m:grow/>
-          </m:dPr>
-          <m:e>
-            <m:r>
-              <m:t>1</m:t>
-            </m:r>
-            <m:r>
-              <m:t> </m:t>
-            </m:r>
-            <m:r>
-              <m:t>2</m:t>
-            </m:r>
-            <m:r>
-              <m:t> </m:t>
-            </m:r>
-            <m:r>
-              <m:t>1</m:t>
-            </m:r>
-          </m:e>
-        </m:d>
+        <m:r>
+          <m:rPr>
+            <m:sty m:val="p"/>
+          </m:rPr>
+          <m:t>[</m:t>
+        </m:r>
+        <m:r>
+          <m:t>1</m:t>
+        </m:r>
+        <m:r>
+          <m:t> </m:t>
+        </m:r>
+        <m:r>
+          <m:t>2</m:t>
+        </m:r>
+        <m:r>
+          <m:t> </m:t>
+        </m:r>
+        <m:r>
+          <m:t>1</m:t>
+        </m:r>
+        <m:r>
+          <m:rPr>
+            <m:sty m:val="p"/>
+          </m:rPr>
+          <m:t>]</m:t>
+        </m:r>
       </m:oMath>
       <w:r>
-        <w:t xml:space="preserve">, each output = (weighted bottom row) − (weighted top row).</w:t>
+        <w:t xml:space="preserve">, each</w:t>
+      </w:r>
+      <w:r>
+        <w:t xml:space="preserve"> </w:t>
+      </w:r>
+      <w:r>
+        <w:t xml:space="preserve">output = (weighted bottom row) − (weighted top row).</w:t>
       </w:r>
     </w:p>
     <w:p>
@@ -5943,7 +6099,13 @@
         <w:pStyle w:val="FirstParagraph"/>
       </w:pPr>
       <w:r>
-        <w:t xml:space="preserve">Note: under the strict mathematical definition (kernel rotated 180°), the rotated</w:t>
+        <w:t xml:space="preserve">Note: under the strict mathematical definition (kernel rotated 180°),</w:t>
+      </w:r>
+      <w:r>
+        <w:t xml:space="preserve"> </w:t>
+      </w:r>
+      <w:r>
+        <w:t xml:space="preserve">the rotated</w:t>
       </w:r>
       <w:r>
         <w:t xml:space="preserve"> </w:t>
@@ -6063,7 +6225,13 @@
         <w:t xml:space="preserve"> </w:t>
       </w:r>
       <w:r>
-        <w:t xml:space="preserve">computes the cross-correlation above.</w:t>
+        <w:t xml:space="preserve">computes the cross-correlation</w:t>
+      </w:r>
+      <w:r>
+        <w:t xml:space="preserve"> </w:t>
+      </w:r>
+      <w:r>
+        <w:t xml:space="preserve">above.</w:t>
       </w:r>
     </w:p>
     <w:bookmarkEnd w:id="25"/>
@@ -6144,14 +6312,14 @@
     <w:tbl>
       <w:tblPr>
         <w:tblStyle w:val="Table"/>
-        <w:tblW w:type="auto" w:w="0"/>
+        <w:tblW w:type="pct" w:w="4865"/>
         <w:tblLook w:firstRow="1" w:lastRow="0" w:firstColumn="0" w:lastColumn="0" w:noHBand="0" w:noVBand="0" w:val="0020"/>
         <w:jc w:val="start"/>
       </w:tblPr>
       <w:tblGrid>
-        <w:gridCol w:w="2640"/>
-        <w:gridCol w:w="2640"/>
-        <w:gridCol w:w="2640"/>
+        <w:gridCol w:w="2568"/>
+        <w:gridCol w:w="2568"/>
+        <w:gridCol w:w="2568"/>
       </w:tblGrid>
       <w:tr>
         <w:trPr>
@@ -6671,7 +6839,10 @@
             <m:t>,</m:t>
           </m:r>
           <m:r>
-            <m:t>  </m:t>
+            <m:t> </m:t>
+          </m:r>
+          <m:r>
+            <m:t> </m:t>
           </m:r>
           <m:r>
             <m:rPr>
@@ -6971,7 +7142,10 @@
             <m:t>,</m:t>
           </m:r>
           <m:r>
-            <m:t>  </m:t>
+            <m:t> </m:t>
+          </m:r>
+          <m:r>
+            <m:t> </m:t>
           </m:r>
           <m:r>
             <m:rPr>
@@ -7191,7 +7365,10 @@
             <m:t>,</m:t>
           </m:r>
           <m:r>
-            <m:t>  </m:t>
+            <m:t> </m:t>
+          </m:r>
+          <m:r>
+            <m:t> </m:t>
           </m:r>
           <m:r>
             <m:rPr>
@@ -7491,7 +7668,10 @@
             <m:t>,</m:t>
           </m:r>
           <m:r>
-            <m:t>  </m:t>
+            <m:t> </m:t>
+          </m:r>
+          <m:r>
+            <m:t> </m:t>
           </m:r>
           <m:r>
             <m:rPr>
@@ -7701,14 +7881,14 @@
     <w:tbl>
       <w:tblPr>
         <w:tblStyle w:val="Table"/>
-        <w:tblW w:type="auto" w:w="0"/>
+        <w:tblW w:type="pct" w:w="4865"/>
         <w:tblLook w:firstRow="1" w:lastRow="0" w:firstColumn="0" w:lastColumn="0" w:noHBand="0" w:noVBand="0" w:val="0020"/>
         <w:jc w:val="start"/>
       </w:tblPr>
       <w:tblGrid>
-        <w:gridCol w:w="2640"/>
-        <w:gridCol w:w="2640"/>
-        <w:gridCol w:w="2640"/>
+        <w:gridCol w:w="2568"/>
+        <w:gridCol w:w="2568"/>
+        <w:gridCol w:w="2568"/>
       </w:tblGrid>
       <w:tr>
         <w:trPr>
@@ -7734,7 +7914,13 @@
               <w:jc w:val="left"/>
             </w:pPr>
             <w:r>
-              <w:t xml:space="preserve">Output shape (W × H × D)</w:t>
+              <w:t xml:space="preserve">Output shape (W × H ×</w:t>
+            </w:r>
+            <w:r>
+              <w:t xml:space="preserve"> </w:t>
+            </w:r>
+            <w:r>
+              <w:t xml:space="preserve">D)</w:t>
             </w:r>
           </w:p>
         </w:tc>
@@ -8027,7 +8213,25 @@
         <w:pStyle w:val="BodyText"/>
       </w:pPr>
       <w:r>
-        <w:t xml:space="preserve">FC1 holds about 99.83% of all parameters, which illustrates why modern networks replace large FC heads with global average pooling. (Pooling floors the fractional sizes; with padding 1 on Pool1, as in ResNet, it would be 56 instead.)</w:t>
+        <w:t xml:space="preserve">FC1 holds about 99.83% of all parameters, which illustrates why modern</w:t>
+      </w:r>
+      <w:r>
+        <w:t xml:space="preserve"> </w:t>
+      </w:r>
+      <w:r>
+        <w:t xml:space="preserve">networks replace large FC heads with global average pooling. (Pooling</w:t>
+      </w:r>
+      <w:r>
+        <w:t xml:space="preserve"> </w:t>
+      </w:r>
+      <w:r>
+        <w:t xml:space="preserve">floors the fractional sizes; with padding 1 on Pool1, as in ResNet, it</w:t>
+      </w:r>
+      <w:r>
+        <w:t xml:space="preserve"> </w:t>
+      </w:r>
+      <w:r>
+        <w:t xml:space="preserve">would be 56 instead.)</w:t>
       </w:r>
     </w:p>
     <w:bookmarkEnd w:id="27"/>
@@ -8184,7 +8388,13 @@
         <w:t xml:space="preserve"> </w:t>
       </w:r>
       <w:r>
-        <w:t xml:space="preserve">images. If the last partial batch is dropped (</w:t>
+        <w:t xml:space="preserve">images. If the last partial batch is</w:t>
+      </w:r>
+      <w:r>
+        <w:t xml:space="preserve"> </w:t>
+      </w:r>
+      <w:r>
+        <w:t xml:space="preserve">dropped (</w:t>
       </w:r>
       <w:r>
         <w:rPr>
@@ -8207,48 +8417,13 @@
         <w:t xml:space="preserve">Part III: Programming &amp; Implementation (30 pts)</w:t>
       </w:r>
     </w:p>
-    <w:p>
-      <w:pPr>
-        <w:pStyle w:val="FirstParagraph"/>
-      </w:pPr>
-      <w:r>
-        <w:t xml:space="preserve">Two scripts are submitted with this document:</w:t>
-      </w:r>
-      <w:r>
-        <w:t xml:space="preserve"> </w:t>
-      </w:r>
-      <w:r>
-        <w:rPr>
-          <w:rStyle w:val="VerbatimChar"/>
-        </w:rPr>
-        <w:t xml:space="preserve">custom_cnn.py</w:t>
-      </w:r>
-      <w:r>
-        <w:t xml:space="preserve"> </w:t>
-      </w:r>
-      <w:r>
-        <w:t xml:space="preserve">and</w:t>
-      </w:r>
-      <w:r>
-        <w:t xml:space="preserve"> </w:t>
-      </w:r>
-      <w:r>
-        <w:rPr>
-          <w:rStyle w:val="VerbatimChar"/>
-        </w:rPr>
-        <w:t xml:space="preserve">transfer_learning_resnet18.py</w:t>
-      </w:r>
-      <w:r>
-        <w:t xml:space="preserve">. Both train on CIFAR-10 and print loss and accuracy per epoch.</w:t>
-      </w:r>
-    </w:p>
-    <w:bookmarkStart w:id="30" w:name="a-custom-3-layer-cnn-custom_cnn.py"/>
+    <w:bookmarkStart w:id="30" w:name="Xbd6f46ea9bbfbff696ae7b9f0f015f883b622cb"/>
     <w:p>
       <w:pPr>
         <w:pStyle w:val="Heading2"/>
       </w:pPr>
       <w:r>
-        <w:t xml:space="preserve">(a) Custom 3-layer CNN (custom_cnn.py)</w:t>
+        <w:t xml:space="preserve">Program Explanation: Custom 3-Layer CNN (custom_cnn.py)</w:t>
       </w:r>
     </w:p>
     <w:p>
@@ -8256,1626 +8431,111 @@
         <w:pStyle w:val="FirstParagraph"/>
       </w:pPr>
       <w:r>
-        <w:t xml:space="preserve">The starter template is extended to three conv blocks (Conv → ReLU → MaxPool), so a 32 × 32 image shrinks to 16, 8, then 4 pixels per side before the classifier.</w:t>
+        <w:t xml:space="preserve">This program builds a convolutional neural network from scratch in PyTorch and trains it to classify images from the CIFAR-10 dataset. It uses the three layer types the problem asks for: nn.Conv2d, nn.MaxPool2d and nn.Linear. CIFAR-10 contains 60,000 small color images (32 × 32 pixels) split across ten classes: airplane, automobile, bird, cat, deer, dog, frog, horse, ship and truck. The question this script answers is how well a small network can learn to recognize these classes when every weight starts out random and the network has to learn every feature on its own.</w:t>
       </w:r>
     </w:p>
-    <w:p>
-      <w:pPr>
-        <w:pStyle w:val="SourceCode"/>
-      </w:pPr>
-      <w:r>
-        <w:rPr>
-          <w:rStyle w:val="KeywordTok"/>
-        </w:rPr>
-        <w:t xml:space="preserve">class</w:t>
-      </w:r>
-      <w:r>
-        <w:rPr>
-          <w:rStyle w:val="NormalTok"/>
-        </w:rPr>
-        <w:t xml:space="preserve"> CustomCNN(nn.Module):</w:t>
-      </w:r>
-      <w:r>
-        <w:br/>
-      </w:r>
-      <w:r>
-        <w:rPr>
-          <w:rStyle w:val="NormalTok"/>
-        </w:rPr>
-        <w:t xml:space="preserve">    </w:t>
-      </w:r>
-      <w:r>
-        <w:rPr>
-          <w:rStyle w:val="KeywordTok"/>
-        </w:rPr>
-        <w:t xml:space="preserve">def</w:t>
-      </w:r>
-      <w:r>
-        <w:rPr>
-          <w:rStyle w:val="NormalTok"/>
-        </w:rPr>
-        <w:t xml:space="preserve"> </w:t>
-      </w:r>
-      <w:r>
-        <w:rPr>
-          <w:rStyle w:val="FunctionTok"/>
-        </w:rPr>
-        <w:t xml:space="preserve">__init__</w:t>
-      </w:r>
-      <w:r>
-        <w:rPr>
-          <w:rStyle w:val="NormalTok"/>
-        </w:rPr>
-        <w:t xml:space="preserve">(</w:t>
-      </w:r>
-      <w:r>
-        <w:rPr>
-          <w:rStyle w:val="VariableTok"/>
-        </w:rPr>
-        <w:t xml:space="preserve">self</w:t>
-      </w:r>
-      <w:r>
-        <w:rPr>
-          <w:rStyle w:val="NormalTok"/>
-        </w:rPr>
-        <w:t xml:space="preserve">, num_classes</w:t>
-      </w:r>
-      <w:r>
-        <w:rPr>
-          <w:rStyle w:val="OperatorTok"/>
-        </w:rPr>
-        <w:t xml:space="preserve">=</w:t>
-      </w:r>
-      <w:r>
-        <w:rPr>
-          <w:rStyle w:val="DecValTok"/>
-        </w:rPr>
-        <w:t xml:space="preserve">10</w:t>
-      </w:r>
-      <w:r>
-        <w:rPr>
-          <w:rStyle w:val="NormalTok"/>
-        </w:rPr>
-        <w:t xml:space="preserve">):</w:t>
-      </w:r>
-      <w:r>
-        <w:br/>
-      </w:r>
-      <w:r>
-        <w:rPr>
-          <w:rStyle w:val="NormalTok"/>
-        </w:rPr>
-        <w:t xml:space="preserve">        </w:t>
-      </w:r>
-      <w:r>
-        <w:rPr>
-          <w:rStyle w:val="BuiltInTok"/>
-        </w:rPr>
-        <w:t xml:space="preserve">super</w:t>
-      </w:r>
-      <w:r>
-        <w:rPr>
-          <w:rStyle w:val="NormalTok"/>
-        </w:rPr>
-        <w:t xml:space="preserve">(CustomCNN, </w:t>
-      </w:r>
-      <w:r>
-        <w:rPr>
-          <w:rStyle w:val="VariableTok"/>
-        </w:rPr>
-        <w:t xml:space="preserve">self</w:t>
-      </w:r>
-      <w:r>
-        <w:rPr>
-          <w:rStyle w:val="NormalTok"/>
-        </w:rPr>
-        <w:t xml:space="preserve">).</w:t>
-      </w:r>
-      <w:r>
-        <w:rPr>
-          <w:rStyle w:val="FunctionTok"/>
-        </w:rPr>
-        <w:t xml:space="preserve">__init__</w:t>
-      </w:r>
-      <w:r>
-        <w:rPr>
-          <w:rStyle w:val="NormalTok"/>
-        </w:rPr>
-        <w:t xml:space="preserve">()</w:t>
-      </w:r>
-      <w:r>
-        <w:br/>
-      </w:r>
-      <w:r>
-        <w:rPr>
-          <w:rStyle w:val="NormalTok"/>
-        </w:rPr>
-        <w:t xml:space="preserve">        </w:t>
-      </w:r>
-      <w:r>
-        <w:rPr>
-          <w:rStyle w:val="VariableTok"/>
-        </w:rPr>
-        <w:t xml:space="preserve">self</w:t>
-      </w:r>
-      <w:r>
-        <w:rPr>
-          <w:rStyle w:val="NormalTok"/>
-        </w:rPr>
-        <w:t xml:space="preserve">.conv1 </w:t>
-      </w:r>
-      <w:r>
-        <w:rPr>
-          <w:rStyle w:val="OperatorTok"/>
-        </w:rPr>
-        <w:t xml:space="preserve">=</w:t>
-      </w:r>
-      <w:r>
-        <w:rPr>
-          <w:rStyle w:val="NormalTok"/>
-        </w:rPr>
-        <w:t xml:space="preserve"> nn.Conv2d(</w:t>
-      </w:r>
-      <w:r>
-        <w:rPr>
-          <w:rStyle w:val="DecValTok"/>
-        </w:rPr>
-        <w:t xml:space="preserve">3</w:t>
-      </w:r>
-      <w:r>
-        <w:rPr>
-          <w:rStyle w:val="NormalTok"/>
-        </w:rPr>
-        <w:t xml:space="preserve">, </w:t>
-      </w:r>
-      <w:r>
-        <w:rPr>
-          <w:rStyle w:val="DecValTok"/>
-        </w:rPr>
-        <w:t xml:space="preserve">32</w:t>
-      </w:r>
-      <w:r>
-        <w:rPr>
-          <w:rStyle w:val="NormalTok"/>
-        </w:rPr>
-        <w:t xml:space="preserve">, kernel_size</w:t>
-      </w:r>
-      <w:r>
-        <w:rPr>
-          <w:rStyle w:val="OperatorTok"/>
-        </w:rPr>
-        <w:t xml:space="preserve">=</w:t>
-      </w:r>
-      <w:r>
-        <w:rPr>
-          <w:rStyle w:val="DecValTok"/>
-        </w:rPr>
-        <w:t xml:space="preserve">3</w:t>
-      </w:r>
-      <w:r>
-        <w:rPr>
-          <w:rStyle w:val="NormalTok"/>
-        </w:rPr>
-        <w:t xml:space="preserve">, padding</w:t>
-      </w:r>
-      <w:r>
-        <w:rPr>
-          <w:rStyle w:val="OperatorTok"/>
-        </w:rPr>
-        <w:t xml:space="preserve">=</w:t>
-      </w:r>
-      <w:r>
-        <w:rPr>
-          <w:rStyle w:val="DecValTok"/>
-        </w:rPr>
-        <w:t xml:space="preserve">1</w:t>
-      </w:r>
-      <w:r>
-        <w:rPr>
-          <w:rStyle w:val="NormalTok"/>
-        </w:rPr>
-        <w:t xml:space="preserve">)</w:t>
-      </w:r>
-      <w:r>
-        <w:br/>
-      </w:r>
-      <w:r>
-        <w:rPr>
-          <w:rStyle w:val="NormalTok"/>
-        </w:rPr>
-        <w:t xml:space="preserve">        </w:t>
-      </w:r>
-      <w:r>
-        <w:rPr>
-          <w:rStyle w:val="VariableTok"/>
-        </w:rPr>
-        <w:t xml:space="preserve">self</w:t>
-      </w:r>
-      <w:r>
-        <w:rPr>
-          <w:rStyle w:val="NormalTok"/>
-        </w:rPr>
-        <w:t xml:space="preserve">.conv2 </w:t>
-      </w:r>
-      <w:r>
-        <w:rPr>
-          <w:rStyle w:val="OperatorTok"/>
-        </w:rPr>
-        <w:t xml:space="preserve">=</w:t>
-      </w:r>
-      <w:r>
-        <w:rPr>
-          <w:rStyle w:val="NormalTok"/>
-        </w:rPr>
-        <w:t xml:space="preserve"> nn.Conv2d(</w:t>
-      </w:r>
-      <w:r>
-        <w:rPr>
-          <w:rStyle w:val="DecValTok"/>
-        </w:rPr>
-        <w:t xml:space="preserve">32</w:t>
-      </w:r>
-      <w:r>
-        <w:rPr>
-          <w:rStyle w:val="NormalTok"/>
-        </w:rPr>
-        <w:t xml:space="preserve">, </w:t>
-      </w:r>
-      <w:r>
-        <w:rPr>
-          <w:rStyle w:val="DecValTok"/>
-        </w:rPr>
-        <w:t xml:space="preserve">64</w:t>
-      </w:r>
-      <w:r>
-        <w:rPr>
-          <w:rStyle w:val="NormalTok"/>
-        </w:rPr>
-        <w:t xml:space="preserve">, kernel_size</w:t>
-      </w:r>
-      <w:r>
-        <w:rPr>
-          <w:rStyle w:val="OperatorTok"/>
-        </w:rPr>
-        <w:t xml:space="preserve">=</w:t>
-      </w:r>
-      <w:r>
-        <w:rPr>
-          <w:rStyle w:val="DecValTok"/>
-        </w:rPr>
-        <w:t xml:space="preserve">3</w:t>
-      </w:r>
-      <w:r>
-        <w:rPr>
-          <w:rStyle w:val="NormalTok"/>
-        </w:rPr>
-        <w:t xml:space="preserve">, padding</w:t>
-      </w:r>
-      <w:r>
-        <w:rPr>
-          <w:rStyle w:val="OperatorTok"/>
-        </w:rPr>
-        <w:t xml:space="preserve">=</w:t>
-      </w:r>
-      <w:r>
-        <w:rPr>
-          <w:rStyle w:val="DecValTok"/>
-        </w:rPr>
-        <w:t xml:space="preserve">1</w:t>
-      </w:r>
-      <w:r>
-        <w:rPr>
-          <w:rStyle w:val="NormalTok"/>
-        </w:rPr>
-        <w:t xml:space="preserve">)</w:t>
-      </w:r>
-      <w:r>
-        <w:br/>
-      </w:r>
-      <w:r>
-        <w:rPr>
-          <w:rStyle w:val="NormalTok"/>
-        </w:rPr>
-        <w:t xml:space="preserve">        </w:t>
-      </w:r>
-      <w:r>
-        <w:rPr>
-          <w:rStyle w:val="VariableTok"/>
-        </w:rPr>
-        <w:t xml:space="preserve">self</w:t>
-      </w:r>
-      <w:r>
-        <w:rPr>
-          <w:rStyle w:val="NormalTok"/>
-        </w:rPr>
-        <w:t xml:space="preserve">.conv3 </w:t>
-      </w:r>
-      <w:r>
-        <w:rPr>
-          <w:rStyle w:val="OperatorTok"/>
-        </w:rPr>
-        <w:t xml:space="preserve">=</w:t>
-      </w:r>
-      <w:r>
-        <w:rPr>
-          <w:rStyle w:val="NormalTok"/>
-        </w:rPr>
-        <w:t xml:space="preserve"> nn.Conv2d(</w:t>
-      </w:r>
-      <w:r>
-        <w:rPr>
-          <w:rStyle w:val="DecValTok"/>
-        </w:rPr>
-        <w:t xml:space="preserve">64</w:t>
-      </w:r>
-      <w:r>
-        <w:rPr>
-          <w:rStyle w:val="NormalTok"/>
-        </w:rPr>
-        <w:t xml:space="preserve">, </w:t>
-      </w:r>
-      <w:r>
-        <w:rPr>
-          <w:rStyle w:val="DecValTok"/>
-        </w:rPr>
-        <w:t xml:space="preserve">128</w:t>
-      </w:r>
-      <w:r>
-        <w:rPr>
-          <w:rStyle w:val="NormalTok"/>
-        </w:rPr>
-        <w:t xml:space="preserve">, kernel_size</w:t>
-      </w:r>
-      <w:r>
-        <w:rPr>
-          <w:rStyle w:val="OperatorTok"/>
-        </w:rPr>
-        <w:t xml:space="preserve">=</w:t>
-      </w:r>
-      <w:r>
-        <w:rPr>
-          <w:rStyle w:val="DecValTok"/>
-        </w:rPr>
-        <w:t xml:space="preserve">3</w:t>
-      </w:r>
-      <w:r>
-        <w:rPr>
-          <w:rStyle w:val="NormalTok"/>
-        </w:rPr>
-        <w:t xml:space="preserve">, padding</w:t>
-      </w:r>
-      <w:r>
-        <w:rPr>
-          <w:rStyle w:val="OperatorTok"/>
-        </w:rPr>
-        <w:t xml:space="preserve">=</w:t>
-      </w:r>
-      <w:r>
-        <w:rPr>
-          <w:rStyle w:val="DecValTok"/>
-        </w:rPr>
-        <w:t xml:space="preserve">1</w:t>
-      </w:r>
-      <w:r>
-        <w:rPr>
-          <w:rStyle w:val="NormalTok"/>
-        </w:rPr>
-        <w:t xml:space="preserve">)</w:t>
-      </w:r>
-      <w:r>
-        <w:br/>
-      </w:r>
-      <w:r>
-        <w:rPr>
-          <w:rStyle w:val="NormalTok"/>
-        </w:rPr>
-        <w:t xml:space="preserve">        </w:t>
-      </w:r>
-      <w:r>
-        <w:rPr>
-          <w:rStyle w:val="VariableTok"/>
-        </w:rPr>
-        <w:t xml:space="preserve">self</w:t>
-      </w:r>
-      <w:r>
-        <w:rPr>
-          <w:rStyle w:val="NormalTok"/>
-        </w:rPr>
-        <w:t xml:space="preserve">.pool </w:t>
-      </w:r>
-      <w:r>
-        <w:rPr>
-          <w:rStyle w:val="OperatorTok"/>
-        </w:rPr>
-        <w:t xml:space="preserve">=</w:t>
-      </w:r>
-      <w:r>
-        <w:rPr>
-          <w:rStyle w:val="NormalTok"/>
-        </w:rPr>
-        <w:t xml:space="preserve"> nn.MaxPool2d(kernel_size</w:t>
-      </w:r>
-      <w:r>
-        <w:rPr>
-          <w:rStyle w:val="OperatorTok"/>
-        </w:rPr>
-        <w:t xml:space="preserve">=</w:t>
-      </w:r>
-      <w:r>
-        <w:rPr>
-          <w:rStyle w:val="DecValTok"/>
-        </w:rPr>
-        <w:t xml:space="preserve">2</w:t>
-      </w:r>
-      <w:r>
-        <w:rPr>
-          <w:rStyle w:val="NormalTok"/>
-        </w:rPr>
-        <w:t xml:space="preserve">, stride</w:t>
-      </w:r>
-      <w:r>
-        <w:rPr>
-          <w:rStyle w:val="OperatorTok"/>
-        </w:rPr>
-        <w:t xml:space="preserve">=</w:t>
-      </w:r>
-      <w:r>
-        <w:rPr>
-          <w:rStyle w:val="DecValTok"/>
-        </w:rPr>
-        <w:t xml:space="preserve">2</w:t>
-      </w:r>
-      <w:r>
-        <w:rPr>
-          <w:rStyle w:val="NormalTok"/>
-        </w:rPr>
-        <w:t xml:space="preserve">)</w:t>
-      </w:r>
-      <w:r>
-        <w:br/>
-      </w:r>
-      <w:r>
-        <w:rPr>
-          <w:rStyle w:val="NormalTok"/>
-        </w:rPr>
-        <w:t xml:space="preserve">        </w:t>
-      </w:r>
-      <w:r>
-        <w:rPr>
-          <w:rStyle w:val="VariableTok"/>
-        </w:rPr>
-        <w:t xml:space="preserve">self</w:t>
-      </w:r>
-      <w:r>
-        <w:rPr>
-          <w:rStyle w:val="NormalTok"/>
-        </w:rPr>
-        <w:t xml:space="preserve">.dropout </w:t>
-      </w:r>
-      <w:r>
-        <w:rPr>
-          <w:rStyle w:val="OperatorTok"/>
-        </w:rPr>
-        <w:t xml:space="preserve">=</w:t>
-      </w:r>
-      <w:r>
-        <w:rPr>
-          <w:rStyle w:val="NormalTok"/>
-        </w:rPr>
-        <w:t xml:space="preserve"> nn.Dropout(</w:t>
-      </w:r>
-      <w:r>
-        <w:rPr>
-          <w:rStyle w:val="FloatTok"/>
-        </w:rPr>
-        <w:t xml:space="preserve">0.3</w:t>
-      </w:r>
-      <w:r>
-        <w:rPr>
-          <w:rStyle w:val="NormalTok"/>
-        </w:rPr>
-        <w:t xml:space="preserve">)</w:t>
-      </w:r>
-      <w:r>
-        <w:br/>
-      </w:r>
-      <w:r>
-        <w:rPr>
-          <w:rStyle w:val="NormalTok"/>
-        </w:rPr>
-        <w:t xml:space="preserve">        </w:t>
-      </w:r>
-      <w:r>
-        <w:rPr>
-          <w:rStyle w:val="VariableTok"/>
-        </w:rPr>
-        <w:t xml:space="preserve">self</w:t>
-      </w:r>
-      <w:r>
-        <w:rPr>
-          <w:rStyle w:val="NormalTok"/>
-        </w:rPr>
-        <w:t xml:space="preserve">.fc1 </w:t>
-      </w:r>
-      <w:r>
-        <w:rPr>
-          <w:rStyle w:val="OperatorTok"/>
-        </w:rPr>
-        <w:t xml:space="preserve">=</w:t>
-      </w:r>
-      <w:r>
-        <w:rPr>
-          <w:rStyle w:val="NormalTok"/>
-        </w:rPr>
-        <w:t xml:space="preserve"> nn.Linear(</w:t>
-      </w:r>
-      <w:r>
-        <w:rPr>
-          <w:rStyle w:val="DecValTok"/>
-        </w:rPr>
-        <w:t xml:space="preserve">128</w:t>
-      </w:r>
-      <w:r>
-        <w:rPr>
-          <w:rStyle w:val="NormalTok"/>
-        </w:rPr>
-        <w:t xml:space="preserve"> </w:t>
-      </w:r>
-      <w:r>
-        <w:rPr>
-          <w:rStyle w:val="OperatorTok"/>
-        </w:rPr>
-        <w:t xml:space="preserve">*</w:t>
-      </w:r>
-      <w:r>
-        <w:rPr>
-          <w:rStyle w:val="NormalTok"/>
-        </w:rPr>
-        <w:t xml:space="preserve"> </w:t>
-      </w:r>
-      <w:r>
-        <w:rPr>
-          <w:rStyle w:val="DecValTok"/>
-        </w:rPr>
-        <w:t xml:space="preserve">4</w:t>
-      </w:r>
-      <w:r>
-        <w:rPr>
-          <w:rStyle w:val="NormalTok"/>
-        </w:rPr>
-        <w:t xml:space="preserve"> </w:t>
-      </w:r>
-      <w:r>
-        <w:rPr>
-          <w:rStyle w:val="OperatorTok"/>
-        </w:rPr>
-        <w:t xml:space="preserve">*</w:t>
-      </w:r>
-      <w:r>
-        <w:rPr>
-          <w:rStyle w:val="NormalTok"/>
-        </w:rPr>
-        <w:t xml:space="preserve"> </w:t>
-      </w:r>
-      <w:r>
-        <w:rPr>
-          <w:rStyle w:val="DecValTok"/>
-        </w:rPr>
-        <w:t xml:space="preserve">4</w:t>
-      </w:r>
-      <w:r>
-        <w:rPr>
-          <w:rStyle w:val="NormalTok"/>
-        </w:rPr>
-        <w:t xml:space="preserve">, </w:t>
-      </w:r>
-      <w:r>
-        <w:rPr>
-          <w:rStyle w:val="DecValTok"/>
-        </w:rPr>
-        <w:t xml:space="preserve">256</w:t>
-      </w:r>
-      <w:r>
-        <w:rPr>
-          <w:rStyle w:val="NormalTok"/>
-        </w:rPr>
-        <w:t xml:space="preserve">)</w:t>
-      </w:r>
-      <w:r>
-        <w:br/>
-      </w:r>
-      <w:r>
-        <w:rPr>
-          <w:rStyle w:val="NormalTok"/>
-        </w:rPr>
-        <w:t xml:space="preserve">        </w:t>
-      </w:r>
-      <w:r>
-        <w:rPr>
-          <w:rStyle w:val="VariableTok"/>
-        </w:rPr>
-        <w:t xml:space="preserve">self</w:t>
-      </w:r>
-      <w:r>
-        <w:rPr>
-          <w:rStyle w:val="NormalTok"/>
-        </w:rPr>
-        <w:t xml:space="preserve">.fc2 </w:t>
-      </w:r>
-      <w:r>
-        <w:rPr>
-          <w:rStyle w:val="OperatorTok"/>
-        </w:rPr>
-        <w:t xml:space="preserve">=</w:t>
-      </w:r>
-      <w:r>
-        <w:rPr>
-          <w:rStyle w:val="NormalTok"/>
-        </w:rPr>
-        <w:t xml:space="preserve"> nn.Linear(</w:t>
-      </w:r>
-      <w:r>
-        <w:rPr>
-          <w:rStyle w:val="DecValTok"/>
-        </w:rPr>
-        <w:t xml:space="preserve">256</w:t>
-      </w:r>
-      <w:r>
-        <w:rPr>
-          <w:rStyle w:val="NormalTok"/>
-        </w:rPr>
-        <w:t xml:space="preserve">, num_classes)</w:t>
-      </w:r>
-      <w:r>
-        <w:br/>
-      </w:r>
-      <w:r>
-        <w:br/>
-      </w:r>
-      <w:r>
-        <w:rPr>
-          <w:rStyle w:val="NormalTok"/>
-        </w:rPr>
-        <w:t xml:space="preserve">    </w:t>
-      </w:r>
-      <w:r>
-        <w:rPr>
-          <w:rStyle w:val="KeywordTok"/>
-        </w:rPr>
-        <w:t xml:space="preserve">def</w:t>
-      </w:r>
-      <w:r>
-        <w:rPr>
-          <w:rStyle w:val="NormalTok"/>
-        </w:rPr>
-        <w:t xml:space="preserve"> forward(</w:t>
-      </w:r>
-      <w:r>
-        <w:rPr>
-          <w:rStyle w:val="VariableTok"/>
-        </w:rPr>
-        <w:t xml:space="preserve">self</w:t>
-      </w:r>
-      <w:r>
-        <w:rPr>
-          <w:rStyle w:val="NormalTok"/>
-        </w:rPr>
-        <w:t xml:space="preserve">, x):</w:t>
-      </w:r>
-      <w:r>
-        <w:br/>
-      </w:r>
-      <w:r>
-        <w:rPr>
-          <w:rStyle w:val="NormalTok"/>
-        </w:rPr>
-        <w:t xml:space="preserve">        x </w:t>
-      </w:r>
-      <w:r>
-        <w:rPr>
-          <w:rStyle w:val="OperatorTok"/>
-        </w:rPr>
-        <w:t xml:space="preserve">=</w:t>
-      </w:r>
-      <w:r>
-        <w:rPr>
-          <w:rStyle w:val="NormalTok"/>
-        </w:rPr>
-        <w:t xml:space="preserve"> </w:t>
-      </w:r>
-      <w:r>
-        <w:rPr>
-          <w:rStyle w:val="VariableTok"/>
-        </w:rPr>
-        <w:t xml:space="preserve">self</w:t>
-      </w:r>
-      <w:r>
-        <w:rPr>
-          <w:rStyle w:val="NormalTok"/>
-        </w:rPr>
-        <w:t xml:space="preserve">.pool(F.relu(</w:t>
-      </w:r>
-      <w:r>
-        <w:rPr>
-          <w:rStyle w:val="VariableTok"/>
-        </w:rPr>
-        <w:t xml:space="preserve">self</w:t>
-      </w:r>
-      <w:r>
-        <w:rPr>
-          <w:rStyle w:val="NormalTok"/>
-        </w:rPr>
-        <w:t xml:space="preserve">.conv1(x)))   </w:t>
-      </w:r>
-      <w:r>
-        <w:rPr>
-          <w:rStyle w:val="CommentTok"/>
-        </w:rPr>
-        <w:t xml:space="preserve"># 32 x 16 x 16</w:t>
-      </w:r>
-      <w:r>
-        <w:br/>
-      </w:r>
-      <w:r>
-        <w:rPr>
-          <w:rStyle w:val="NormalTok"/>
-        </w:rPr>
-        <w:t xml:space="preserve">        x </w:t>
-      </w:r>
-      <w:r>
-        <w:rPr>
-          <w:rStyle w:val="OperatorTok"/>
-        </w:rPr>
-        <w:t xml:space="preserve">=</w:t>
-      </w:r>
-      <w:r>
-        <w:rPr>
-          <w:rStyle w:val="NormalTok"/>
-        </w:rPr>
-        <w:t xml:space="preserve"> </w:t>
-      </w:r>
-      <w:r>
-        <w:rPr>
-          <w:rStyle w:val="VariableTok"/>
-        </w:rPr>
-        <w:t xml:space="preserve">self</w:t>
-      </w:r>
-      <w:r>
-        <w:rPr>
-          <w:rStyle w:val="NormalTok"/>
-        </w:rPr>
-        <w:t xml:space="preserve">.pool(F.relu(</w:t>
-      </w:r>
-      <w:r>
-        <w:rPr>
-          <w:rStyle w:val="VariableTok"/>
-        </w:rPr>
-        <w:t xml:space="preserve">self</w:t>
-      </w:r>
-      <w:r>
-        <w:rPr>
-          <w:rStyle w:val="NormalTok"/>
-        </w:rPr>
-        <w:t xml:space="preserve">.conv2(x)))   </w:t>
-      </w:r>
-      <w:r>
-        <w:rPr>
-          <w:rStyle w:val="CommentTok"/>
-        </w:rPr>
-        <w:t xml:space="preserve"># 64 x 8 x 8</w:t>
-      </w:r>
-      <w:r>
-        <w:br/>
-      </w:r>
-      <w:r>
-        <w:rPr>
-          <w:rStyle w:val="NormalTok"/>
-        </w:rPr>
-        <w:t xml:space="preserve">        x </w:t>
-      </w:r>
-      <w:r>
-        <w:rPr>
-          <w:rStyle w:val="OperatorTok"/>
-        </w:rPr>
-        <w:t xml:space="preserve">=</w:t>
-      </w:r>
-      <w:r>
-        <w:rPr>
-          <w:rStyle w:val="NormalTok"/>
-        </w:rPr>
-        <w:t xml:space="preserve"> </w:t>
-      </w:r>
-      <w:r>
-        <w:rPr>
-          <w:rStyle w:val="VariableTok"/>
-        </w:rPr>
-        <w:t xml:space="preserve">self</w:t>
-      </w:r>
-      <w:r>
-        <w:rPr>
-          <w:rStyle w:val="NormalTok"/>
-        </w:rPr>
-        <w:t xml:space="preserve">.pool(F.relu(</w:t>
-      </w:r>
-      <w:r>
-        <w:rPr>
-          <w:rStyle w:val="VariableTok"/>
-        </w:rPr>
-        <w:t xml:space="preserve">self</w:t>
-      </w:r>
-      <w:r>
-        <w:rPr>
-          <w:rStyle w:val="NormalTok"/>
-        </w:rPr>
-        <w:t xml:space="preserve">.conv3(x)))   </w:t>
-      </w:r>
-      <w:r>
-        <w:rPr>
-          <w:rStyle w:val="CommentTok"/>
-        </w:rPr>
-        <w:t xml:space="preserve"># 128 x 4 x 4</w:t>
-      </w:r>
-      <w:r>
-        <w:br/>
-      </w:r>
-      <w:r>
-        <w:rPr>
-          <w:rStyle w:val="NormalTok"/>
-        </w:rPr>
-        <w:t xml:space="preserve">        x </w:t>
-      </w:r>
-      <w:r>
-        <w:rPr>
-          <w:rStyle w:val="OperatorTok"/>
-        </w:rPr>
-        <w:t xml:space="preserve">=</w:t>
-      </w:r>
-      <w:r>
-        <w:rPr>
-          <w:rStyle w:val="NormalTok"/>
-        </w:rPr>
-        <w:t xml:space="preserve"> x.view(x.size(</w:t>
-      </w:r>
-      <w:r>
-        <w:rPr>
-          <w:rStyle w:val="DecValTok"/>
-        </w:rPr>
-        <w:t xml:space="preserve">0</w:t>
-      </w:r>
-      <w:r>
-        <w:rPr>
-          <w:rStyle w:val="NormalTok"/>
-        </w:rPr>
-        <w:t xml:space="preserve">), </w:t>
-      </w:r>
-      <w:r>
-        <w:rPr>
-          <w:rStyle w:val="OperatorTok"/>
-        </w:rPr>
-        <w:t xml:space="preserve">-</w:t>
-      </w:r>
-      <w:r>
-        <w:rPr>
-          <w:rStyle w:val="DecValTok"/>
-        </w:rPr>
-        <w:t xml:space="preserve">1</w:t>
-      </w:r>
-      <w:r>
-        <w:rPr>
-          <w:rStyle w:val="NormalTok"/>
-        </w:rPr>
-        <w:t xml:space="preserve">)</w:t>
-      </w:r>
-      <w:r>
-        <w:br/>
-      </w:r>
-      <w:r>
-        <w:rPr>
-          <w:rStyle w:val="NormalTok"/>
-        </w:rPr>
-        <w:t xml:space="preserve">        x </w:t>
-      </w:r>
-      <w:r>
-        <w:rPr>
-          <w:rStyle w:val="OperatorTok"/>
-        </w:rPr>
-        <w:t xml:space="preserve">=</w:t>
-      </w:r>
-      <w:r>
-        <w:rPr>
-          <w:rStyle w:val="NormalTok"/>
-        </w:rPr>
-        <w:t xml:space="preserve"> </w:t>
-      </w:r>
-      <w:r>
-        <w:rPr>
-          <w:rStyle w:val="VariableTok"/>
-        </w:rPr>
-        <w:t xml:space="preserve">self</w:t>
-      </w:r>
-      <w:r>
-        <w:rPr>
-          <w:rStyle w:val="NormalTok"/>
-        </w:rPr>
-        <w:t xml:space="preserve">.dropout(F.relu(</w:t>
-      </w:r>
-      <w:r>
-        <w:rPr>
-          <w:rStyle w:val="VariableTok"/>
-        </w:rPr>
-        <w:t xml:space="preserve">self</w:t>
-      </w:r>
-      <w:r>
-        <w:rPr>
-          <w:rStyle w:val="NormalTok"/>
-        </w:rPr>
-        <w:t xml:space="preserve">.fc1(x)))</w:t>
-      </w:r>
-      <w:r>
-        <w:br/>
-      </w:r>
-      <w:r>
-        <w:rPr>
-          <w:rStyle w:val="NormalTok"/>
-        </w:rPr>
-        <w:t xml:space="preserve">        </w:t>
-      </w:r>
-      <w:r>
-        <w:rPr>
-          <w:rStyle w:val="ControlFlowTok"/>
-        </w:rPr>
-        <w:t xml:space="preserve">return</w:t>
-      </w:r>
-      <w:r>
-        <w:rPr>
-          <w:rStyle w:val="NormalTok"/>
-        </w:rPr>
-        <w:t xml:space="preserve"> </w:t>
-      </w:r>
-      <w:r>
-        <w:rPr>
-          <w:rStyle w:val="VariableTok"/>
-        </w:rPr>
-        <w:t xml:space="preserve">self</w:t>
-      </w:r>
-      <w:r>
-        <w:rPr>
-          <w:rStyle w:val="NormalTok"/>
-        </w:rPr>
-        <w:t xml:space="preserve">.fc2(x)                     </w:t>
-      </w:r>
-      <w:r>
-        <w:rPr>
-          <w:rStyle w:val="CommentTok"/>
-        </w:rPr>
-        <w:t xml:space="preserve"># logits</w:t>
-      </w:r>
-      <w:r>
-        <w:br/>
-      </w:r>
-      <w:r>
-        <w:br/>
-      </w:r>
-      <w:r>
-        <w:rPr>
-          <w:rStyle w:val="NormalTok"/>
-        </w:rPr>
-        <w:t xml:space="preserve">criterion </w:t>
-      </w:r>
-      <w:r>
-        <w:rPr>
-          <w:rStyle w:val="OperatorTok"/>
-        </w:rPr>
-        <w:t xml:space="preserve">=</w:t>
-      </w:r>
-      <w:r>
-        <w:rPr>
-          <w:rStyle w:val="NormalTok"/>
-        </w:rPr>
-        <w:t xml:space="preserve"> nn.CrossEntropyLoss()</w:t>
-      </w:r>
-      <w:r>
-        <w:br/>
-      </w:r>
-      <w:r>
-        <w:rPr>
-          <w:rStyle w:val="NormalTok"/>
-        </w:rPr>
-        <w:t xml:space="preserve">optimizer </w:t>
-      </w:r>
-      <w:r>
-        <w:rPr>
-          <w:rStyle w:val="OperatorTok"/>
-        </w:rPr>
-        <w:t xml:space="preserve">=</w:t>
-      </w:r>
-      <w:r>
-        <w:rPr>
-          <w:rStyle w:val="NormalTok"/>
-        </w:rPr>
-        <w:t xml:space="preserve"> torch.optim.Adam(model.parameters(), lr</w:t>
-      </w:r>
-      <w:r>
-        <w:rPr>
-          <w:rStyle w:val="OperatorTok"/>
-        </w:rPr>
-        <w:t xml:space="preserve">=</w:t>
-      </w:r>
-      <w:r>
-        <w:rPr>
-          <w:rStyle w:val="FloatTok"/>
-        </w:rPr>
-        <w:t xml:space="preserve">1e-3</w:t>
-      </w:r>
-      <w:r>
-        <w:rPr>
-          <w:rStyle w:val="NormalTok"/>
-        </w:rPr>
-        <w:t xml:space="preserve">)</w:t>
-      </w:r>
-    </w:p>
-    <w:tbl>
-      <w:tblPr>
-        <w:tblStyle w:val="Table"/>
-        <w:tblW w:type="auto" w:w="0"/>
-        <w:tblLook w:firstRow="1" w:lastRow="0" w:firstColumn="0" w:lastColumn="0" w:noHBand="0" w:noVBand="0" w:val="0020"/>
-        <w:jc w:val="start"/>
-      </w:tblPr>
-      <w:tblGrid>
-        <w:gridCol w:w="2640"/>
-        <w:gridCol w:w="2640"/>
-        <w:gridCol w:w="2640"/>
-      </w:tblGrid>
-      <w:tr>
-        <w:trPr>
-          <w:tblHeader w:val="true"/>
-        </w:trPr>
-        <w:tc>
-          <w:tcPr/>
-          <w:p>
-            <w:pPr>
-              <w:pStyle w:val="Compact"/>
-              <w:jc w:val="left"/>
-            </w:pPr>
-            <w:r>
-              <w:t xml:space="preserve">Layer</w:t>
-            </w:r>
-          </w:p>
-        </w:tc>
-        <w:tc>
-          <w:tcPr/>
-          <w:p>
-            <w:pPr>
-              <w:pStyle w:val="Compact"/>
-              <w:jc w:val="left"/>
-            </w:pPr>
-            <w:r>
-              <w:t xml:space="preserve">Output shape</w:t>
-            </w:r>
-          </w:p>
-        </w:tc>
-        <w:tc>
-          <w:tcPr/>
-          <w:p>
-            <w:pPr>
-              <w:pStyle w:val="Compact"/>
-              <w:jc w:val="left"/>
-            </w:pPr>
-            <w:r>
-              <w:t xml:space="preserve">Parameters</w:t>
-            </w:r>
-          </w:p>
-        </w:tc>
-      </w:tr>
-      <w:tr>
-        <w:tc>
-          <w:tcPr/>
-          <w:p>
-            <w:pPr>
-              <w:pStyle w:val="Compact"/>
-              <w:jc w:val="left"/>
-            </w:pPr>
-            <w:r>
-              <w:t xml:space="preserve">conv1 + pool</w:t>
-            </w:r>
-          </w:p>
-        </w:tc>
-        <w:tc>
-          <w:tcPr/>
-          <w:p>
-            <w:pPr>
-              <w:pStyle w:val="Compact"/>
-              <w:jc w:val="left"/>
-            </w:pPr>
-            <w:r>
-              <w:t xml:space="preserve">32 × 16 × 16</w:t>
-            </w:r>
-          </w:p>
-        </w:tc>
-        <w:tc>
-          <w:tcPr/>
-          <w:p>
-            <w:pPr>
-              <w:pStyle w:val="Compact"/>
-              <w:jc w:val="left"/>
-            </w:pPr>
-            <w:r>
-              <w:t xml:space="preserve">(3·3·3 + 1)·32 = 896</w:t>
-            </w:r>
-          </w:p>
-        </w:tc>
-      </w:tr>
-      <w:tr>
-        <w:tc>
-          <w:tcPr/>
-          <w:p>
-            <w:pPr>
-              <w:pStyle w:val="Compact"/>
-              <w:jc w:val="left"/>
-            </w:pPr>
-            <w:r>
-              <w:t xml:space="preserve">conv2 + pool</w:t>
-            </w:r>
-          </w:p>
-        </w:tc>
-        <w:tc>
-          <w:tcPr/>
-          <w:p>
-            <w:pPr>
-              <w:pStyle w:val="Compact"/>
-              <w:jc w:val="left"/>
-            </w:pPr>
-            <w:r>
-              <w:t xml:space="preserve">64 × 8 × 8</w:t>
-            </w:r>
-          </w:p>
-        </w:tc>
-        <w:tc>
-          <w:tcPr/>
-          <w:p>
-            <w:pPr>
-              <w:pStyle w:val="Compact"/>
-              <w:jc w:val="left"/>
-            </w:pPr>
-            <w:r>
-              <w:t xml:space="preserve">(3·3·32 + 1)·64 = 18,496</w:t>
-            </w:r>
-          </w:p>
-        </w:tc>
-      </w:tr>
-      <w:tr>
-        <w:tc>
-          <w:tcPr/>
-          <w:p>
-            <w:pPr>
-              <w:pStyle w:val="Compact"/>
-              <w:jc w:val="left"/>
-            </w:pPr>
-            <w:r>
-              <w:t xml:space="preserve">conv3 + pool</w:t>
-            </w:r>
-          </w:p>
-        </w:tc>
-        <w:tc>
-          <w:tcPr/>
-          <w:p>
-            <w:pPr>
-              <w:pStyle w:val="Compact"/>
-              <w:jc w:val="left"/>
-            </w:pPr>
-            <w:r>
-              <w:t xml:space="preserve">128 × 4 × 4</w:t>
-            </w:r>
-          </w:p>
-        </w:tc>
-        <w:tc>
-          <w:tcPr/>
-          <w:p>
-            <w:pPr>
-              <w:pStyle w:val="Compact"/>
-              <w:jc w:val="left"/>
-            </w:pPr>
-            <w:r>
-              <w:t xml:space="preserve">(3·3·64 + 1)·128 = 73,856</w:t>
-            </w:r>
-          </w:p>
-        </w:tc>
-      </w:tr>
-      <w:tr>
-        <w:tc>
-          <w:tcPr/>
-          <w:p>
-            <w:pPr>
-              <w:pStyle w:val="Compact"/>
-              <w:jc w:val="left"/>
-            </w:pPr>
-            <w:r>
-              <w:t xml:space="preserve">fc1</w:t>
-            </w:r>
-          </w:p>
-        </w:tc>
-        <w:tc>
-          <w:tcPr/>
-          <w:p>
-            <w:pPr>
-              <w:pStyle w:val="Compact"/>
-              <w:jc w:val="left"/>
-            </w:pPr>
-            <w:r>
-              <w:t xml:space="preserve">256</w:t>
-            </w:r>
-          </w:p>
-        </w:tc>
-        <w:tc>
-          <w:tcPr/>
-          <w:p>
-            <w:pPr>
-              <w:pStyle w:val="Compact"/>
-              <w:jc w:val="left"/>
-            </w:pPr>
-            <w:r>
-              <w:t xml:space="preserve">2,048·256 + 256 = 524,544</w:t>
-            </w:r>
-          </w:p>
-        </w:tc>
-      </w:tr>
-      <w:tr>
-        <w:tc>
-          <w:tcPr/>
-          <w:p>
-            <w:pPr>
-              <w:pStyle w:val="Compact"/>
-              <w:jc w:val="left"/>
-            </w:pPr>
-            <w:r>
-              <w:t xml:space="preserve">fc2</w:t>
-            </w:r>
-          </w:p>
-        </w:tc>
-        <w:tc>
-          <w:tcPr/>
-          <w:p>
-            <w:pPr>
-              <w:pStyle w:val="Compact"/>
-              <w:jc w:val="left"/>
-            </w:pPr>
-            <w:r>
-              <w:t xml:space="preserve">10</w:t>
-            </w:r>
-          </w:p>
-        </w:tc>
-        <w:tc>
-          <w:tcPr/>
-          <w:p>
-            <w:pPr>
-              <w:pStyle w:val="Compact"/>
-              <w:jc w:val="left"/>
-            </w:pPr>
-            <w:r>
-              <w:t xml:space="preserve">256·10 + 10 = 2,570</w:t>
-            </w:r>
-          </w:p>
-        </w:tc>
-      </w:tr>
-      <w:tr>
-        <w:tc>
-          <w:tcPr/>
-          <w:p>
-            <w:pPr>
-              <w:pStyle w:val="Compact"/>
-              <w:jc w:val="left"/>
-            </w:pPr>
-            <w:r>
-              <w:rPr>
-                <w:bCs/>
-                <w:b/>
-              </w:rPr>
-              <w:t xml:space="preserve">Total</w:t>
-            </w:r>
-          </w:p>
-        </w:tc>
-        <w:tc>
-          <w:tcPr/>
-          <w:p>
-            <w:pPr>
-              <w:pStyle w:val="Compact"/>
-            </w:pPr>
-          </w:p>
-        </w:tc>
-        <w:tc>
-          <w:tcPr/>
-          <w:p>
-            <w:pPr>
-              <w:pStyle w:val="Compact"/>
-              <w:jc w:val="left"/>
-            </w:pPr>
-            <w:r>
-              <w:rPr>
-                <w:bCs/>
-                <w:b/>
-              </w:rPr>
-              <w:t xml:space="preserve">620,362</w:t>
-            </w:r>
-          </w:p>
-        </w:tc>
-      </w:tr>
-    </w:tbl>
     <w:p>
       <w:pPr>
         <w:pStyle w:val="BodyText"/>
       </w:pPr>
       <w:r>
-        <w:t xml:space="preserve">Each training step runs</w:t>
-      </w:r>
-      <w:r>
-        <w:t xml:space="preserve"> </w:t>
-      </w:r>
-      <w:r>
-        <w:rPr>
-          <w:rStyle w:val="VerbatimChar"/>
-        </w:rPr>
-        <w:t xml:space="preserve">zero_grad()</w:t>
-      </w:r>
-      <w:r>
-        <w:t xml:space="preserve"> </w:t>
-      </w:r>
-      <w:r>
-        <w:t xml:space="preserve">→ forward →</w:t>
-      </w:r>
-      <w:r>
-        <w:t xml:space="preserve"> </w:t>
-      </w:r>
-      <w:r>
-        <w:rPr>
-          <w:rStyle w:val="VerbatimChar"/>
-        </w:rPr>
-        <w:t xml:space="preserve">CrossEntropyLoss</w:t>
-      </w:r>
-      <w:r>
-        <w:t xml:space="preserve"> </w:t>
-      </w:r>
-      <w:r>
-        <w:t xml:space="preserve">→</w:t>
-      </w:r>
-      <w:r>
-        <w:t xml:space="preserve"> </w:t>
-      </w:r>
-      <w:r>
-        <w:rPr>
-          <w:rStyle w:val="VerbatimChar"/>
-        </w:rPr>
-        <w:t xml:space="preserve">backward()</w:t>
-      </w:r>
-      <w:r>
-        <w:t xml:space="preserve"> </w:t>
-      </w:r>
-      <w:r>
-        <w:t xml:space="preserve">→</w:t>
-      </w:r>
-      <w:r>
-        <w:t xml:space="preserve"> </w:t>
-      </w:r>
-      <w:r>
-        <w:rPr>
-          <w:rStyle w:val="VerbatimChar"/>
-        </w:rPr>
-        <w:t xml:space="preserve">optimizer.step()</w:t>
-      </w:r>
-      <w:r>
-        <w:t xml:space="preserve">. The model outputs raw logits because</w:t>
-      </w:r>
-      <w:r>
-        <w:t xml:space="preserve"> </w:t>
-      </w:r>
-      <w:r>
-        <w:rPr>
-          <w:rStyle w:val="VerbatimChar"/>
-        </w:rPr>
-        <w:t xml:space="preserve">CrossEntropyLoss</w:t>
-      </w:r>
-      <w:r>
-        <w:t xml:space="preserve"> </w:t>
-      </w:r>
-      <w:r>
-        <w:t xml:space="preserve">applies log-softmax internally. Training uses random crop and horizontal flip augmentation, 15 epochs, batch size 128.</w:t>
+        <w:t xml:space="preserve">The starter template in the assignment only had two convolutional layers, so I added a third one (conv3) to meet the three-layer requirement. Each convolutional block runs the image through a 3 × 3 convolution with padding of 1, then a ReLU activation, then a 2 × 2 max pool with a stride of 2. The padding keeps the width and height the same through the convolution, and the pool cuts them in half. Because of that, a 32 × 32 image shrinks to 16 × 16, then 8 × 8, then 4 × 4, while the number of channels doubles from 32 to 64 to 128. This trades spatial detail for more feature channels as the network goes deeper, so the early layers pick up simple edges and the later layers pick up larger shapes and textures. Adding the third block also changed the input size of the first fully connected layer from 64 × 8 × 8 in the template to 128 × 4 × 4 = 2,048.</w:t>
+      </w:r>
+    </w:p>
+    <w:p>
+      <w:pPr>
+        <w:pStyle w:val="BodyText"/>
+      </w:pPr>
+      <w:r>
+        <w:t xml:space="preserve">After the last pool, x.view() flattens the 128 × 4 × 4 output into a vector of 2,048 values. That vector goes through fc1, which has 256 neurons followed by ReLU, and then fc2, which has 10 outputs, one per class. I put a Dropout of 0.3 after fc1, which randomly turns off 30% of those neurons during training so the network does not rely too heavily on any one of them and overfits less. The forward() function returns raw scores (logits) instead of probabilities because nn.CrossEntropyLoss already applies the softmax internally, and adding another softmax in the model would apply it twice. Using the parameter formula from Part I, the learnable parameters in each layer are:</w:t>
+      </w:r>
+    </w:p>
+    <w:p>
+      <w:pPr>
+        <w:pStyle w:val="BodyText"/>
+      </w:pPr>
+      <w:r>
+        <w:t xml:space="preserve">conv1 = (3·3·3 + 1)·32 = 896</w:t>
+      </w:r>
+      <w:r>
+        <w:br/>
+      </w:r>
+      <w:r>
+        <w:t xml:space="preserve">conv2 = (3·3·32 + 1)·64 = 18,496</w:t>
+      </w:r>
+      <w:r>
+        <w:br/>
+      </w:r>
+      <w:r>
+        <w:t xml:space="preserve">conv3 = (3·3·64 + 1)·128 = 73,856</w:t>
+      </w:r>
+      <w:r>
+        <w:br/>
+      </w:r>
+      <w:r>
+        <w:t xml:space="preserve">fc1 = 2,048·256 + 256 = 524,544</w:t>
+      </w:r>
+      <w:r>
+        <w:br/>
+      </w:r>
+      <w:r>
+        <w:t xml:space="preserve">fc2 = 256·10 + 10 = 2,570</w:t>
+      </w:r>
+      <w:r>
+        <w:br/>
+      </w:r>
+      <w:r>
+        <w:t xml:space="preserve">Total = 620,362</w:t>
+      </w:r>
+    </w:p>
+    <w:p>
+      <w:pPr>
+        <w:pStyle w:val="BodyText"/>
+      </w:pPr>
+      <w:r>
+        <w:t xml:space="preserve">About 85% of all the parameters are in fc1. This is the same point from Part I: the convolutional layers share their weights across the whole image, while the fully connected layer needs a separate weight for every input and output pair.</w:t>
+      </w:r>
+    </w:p>
+    <w:p>
+      <w:pPr>
+        <w:pStyle w:val="BodyText"/>
+      </w:pPr>
+      <w:r>
+        <w:t xml:space="preserve">The data is loaded in get_loaders(). Every image is normalized with the CIFAR-10 channel mean (0.4914, 0.4822, 0.4465) and standard deviation (0.2470, 0.2435, 0.2616) so the inputs are centered near zero, which makes training faster and more stable. For the training images only, I added RandomCrop(32, padding=4) and RandomHorizontalFlip(), so the network sees slightly shifted and mirrored versions of each picture and generalizes better. The 10,000 test images are not augmented, so the test accuracy is measured on the original images. The data is fed in batches of 128, which gives 391 weight updates per epoch over the 50,000 training images.</w:t>
+      </w:r>
+    </w:p>
+    <w:p>
+      <w:pPr>
+        <w:pStyle w:val="BodyText"/>
+      </w:pPr>
+      <w:r>
+        <w:t xml:space="preserve">Training happens in train_one_epoch(), which runs the same five steps on every batch. First, optimizer.zero_grad() clears the gradients from the previous batch, since PyTorch adds new gradients to the old ones by default. Second, the forward pass sends the images through the model. Third, CrossEntropyLoss compares the predicted scores to the true labels. Fourth, loss.backward() runs backpropagation to find the gradient of the loss with respect to every weight. Fifth, optimizer.step() updates the weights using the Adam optimizer with a learning rate of 0.001. Adam keeps a running average of each weight’s gradient and its variance, so every weight gets its own step size. The cross-entropy loss for one image is:</w:t>
+      </w:r>
+    </w:p>
+    <w:p>
+      <w:pPr>
+        <w:pStyle w:val="BodyText"/>
+      </w:pPr>
+      <w:r>
+        <w:t xml:space="preserve">Loss = −log( e^(z_y) / Σ_j e^(z_j) )</w:t>
+      </w:r>
+    </w:p>
+    <w:p>
+      <w:pPr>
+        <w:pStyle w:val="BodyText"/>
+      </w:pPr>
+      <w:r>
+        <w:t xml:space="preserve">where z_j is the score for class j and y is the correct class. After each epoch, evaluate() runs the model on the test set with model.eval() and torch.no_grad(), which turns dropout off and stops gradient tracking so evaluation is faster and gives the same answer every time. I kept torch.manual_seed(42) so the results are reproducible. The script trains for 15 epochs, prints the training and test loss and accuracy after each one, and saves the final weights to custom_cnn_cifar10.pth.</w:t>
       </w:r>
     </w:p>
     <w:bookmarkEnd w:id="30"/>
-    <w:bookmarkStart w:id="31" w:name="X6087830541218726607949defd38d27d91d0c4f"/>
+    <w:bookmarkStart w:id="31" w:name="X5e2fc6240c8beff1a525410fd2be7db228f3c7c"/>
     <w:p>
       <w:pPr>
         <w:pStyle w:val="Heading2"/>
       </w:pPr>
       <w:r>
-        <w:t xml:space="preserve">(b) Transfer learning with ResNet-18 (transfer_learning_resnet18.py)</w:t>
-      </w:r>
-    </w:p>
-    <w:p>
-      <w:pPr>
-        <w:pStyle w:val="SourceCode"/>
-      </w:pPr>
-      <w:r>
-        <w:rPr>
-          <w:rStyle w:val="NormalTok"/>
-        </w:rPr>
-        <w:t xml:space="preserve">model </w:t>
-      </w:r>
-      <w:r>
-        <w:rPr>
-          <w:rStyle w:val="OperatorTok"/>
-        </w:rPr>
-        <w:t xml:space="preserve">=</w:t>
-      </w:r>
-      <w:r>
-        <w:rPr>
-          <w:rStyle w:val="NormalTok"/>
-        </w:rPr>
-        <w:t xml:space="preserve"> torchvision.models.resnet18(pretrained</w:t>
-      </w:r>
-      <w:r>
-        <w:rPr>
-          <w:rStyle w:val="OperatorTok"/>
-        </w:rPr>
-        <w:t xml:space="preserve">=</w:t>
-      </w:r>
-      <w:r>
-        <w:rPr>
-          <w:rStyle w:val="VariableTok"/>
-        </w:rPr>
-        <w:t xml:space="preserve">True</w:t>
-      </w:r>
-      <w:r>
-        <w:rPr>
-          <w:rStyle w:val="NormalTok"/>
-        </w:rPr>
-        <w:t xml:space="preserve">)   </w:t>
-      </w:r>
-      <w:r>
-        <w:rPr>
-          <w:rStyle w:val="CommentTok"/>
-        </w:rPr>
-        <w:t xml:space="preserve"># ImageNet weights</w:t>
-      </w:r>
-      <w:r>
-        <w:br/>
-      </w:r>
-      <w:r>
-        <w:br/>
-      </w:r>
-      <w:r>
-        <w:rPr>
-          <w:rStyle w:val="CommentTok"/>
-        </w:rPr>
-        <w:t xml:space="preserve"># Freeze the feature-extraction backbone</w:t>
-      </w:r>
-      <w:r>
-        <w:br/>
-      </w:r>
-      <w:r>
-        <w:rPr>
-          <w:rStyle w:val="ControlFlowTok"/>
-        </w:rPr>
-        <w:t xml:space="preserve">for</w:t>
-      </w:r>
-      <w:r>
-        <w:rPr>
-          <w:rStyle w:val="NormalTok"/>
-        </w:rPr>
-        <w:t xml:space="preserve"> param </w:t>
-      </w:r>
-      <w:r>
-        <w:rPr>
-          <w:rStyle w:val="KeywordTok"/>
-        </w:rPr>
-        <w:t xml:space="preserve">in</w:t>
-      </w:r>
-      <w:r>
-        <w:rPr>
-          <w:rStyle w:val="NormalTok"/>
-        </w:rPr>
-        <w:t xml:space="preserve"> model.parameters():</w:t>
-      </w:r>
-      <w:r>
-        <w:br/>
-      </w:r>
-      <w:r>
-        <w:rPr>
-          <w:rStyle w:val="NormalTok"/>
-        </w:rPr>
-        <w:t xml:space="preserve">    param.requires_grad </w:t>
-      </w:r>
-      <w:r>
-        <w:rPr>
-          <w:rStyle w:val="OperatorTok"/>
-        </w:rPr>
-        <w:t xml:space="preserve">=</w:t>
-      </w:r>
-      <w:r>
-        <w:rPr>
-          <w:rStyle w:val="NormalTok"/>
-        </w:rPr>
-        <w:t xml:space="preserve"> </w:t>
-      </w:r>
-      <w:r>
-        <w:rPr>
-          <w:rStyle w:val="VariableTok"/>
-        </w:rPr>
-        <w:t xml:space="preserve">False</w:t>
-      </w:r>
-      <w:r>
-        <w:br/>
-      </w:r>
-      <w:r>
-        <w:br/>
-      </w:r>
-      <w:r>
-        <w:rPr>
-          <w:rStyle w:val="CommentTok"/>
-        </w:rPr>
-        <w:t xml:space="preserve"># Replace the head: Linear(512 -&gt; 1000) becomes Linear(512 -&gt; num_classes)</w:t>
-      </w:r>
-      <w:r>
-        <w:br/>
-      </w:r>
-      <w:r>
-        <w:rPr>
-          <w:rStyle w:val="NormalTok"/>
-        </w:rPr>
-        <w:t xml:space="preserve">model.fc </w:t>
-      </w:r>
-      <w:r>
-        <w:rPr>
-          <w:rStyle w:val="OperatorTok"/>
-        </w:rPr>
-        <w:t xml:space="preserve">=</w:t>
-      </w:r>
-      <w:r>
-        <w:rPr>
-          <w:rStyle w:val="NormalTok"/>
-        </w:rPr>
-        <w:t xml:space="preserve"> nn.Linear(model.fc.in_features, num_classes)</w:t>
-      </w:r>
-      <w:r>
-        <w:br/>
-      </w:r>
-      <w:r>
-        <w:br/>
-      </w:r>
-      <w:r>
-        <w:rPr>
-          <w:rStyle w:val="NormalTok"/>
-        </w:rPr>
-        <w:t xml:space="preserve">optimizer </w:t>
-      </w:r>
-      <w:r>
-        <w:rPr>
-          <w:rStyle w:val="OperatorTok"/>
-        </w:rPr>
-        <w:t xml:space="preserve">=</w:t>
-      </w:r>
-      <w:r>
-        <w:rPr>
-          <w:rStyle w:val="NormalTok"/>
-        </w:rPr>
-        <w:t xml:space="preserve"> torch.optim.Adam(model.fc.parameters(), lr</w:t>
-      </w:r>
-      <w:r>
-        <w:rPr>
-          <w:rStyle w:val="OperatorTok"/>
-        </w:rPr>
-        <w:t xml:space="preserve">=</w:t>
-      </w:r>
-      <w:r>
-        <w:rPr>
-          <w:rStyle w:val="FloatTok"/>
-        </w:rPr>
-        <w:t xml:space="preserve">1e-3</w:t>
-      </w:r>
-      <w:r>
-        <w:rPr>
-          <w:rStyle w:val="NormalTok"/>
-        </w:rPr>
-        <w:t xml:space="preserve">)</w:t>
+        <w:t xml:space="preserve">Program Explanation: Transfer Learning with ResNet-18 (transfer_learning_resnet18.py)</w:t>
       </w:r>
     </w:p>
     <w:p>
@@ -9883,238 +8543,69 @@
         <w:pStyle w:val="FirstParagraph"/>
       </w:pPr>
       <w:r>
-        <w:t xml:space="preserve">Key points:</w:t>
+        <w:t xml:space="preserve">This program takes a different approach to the same CIFAR-10 problem. Instead of training a network from scratch, it reuses ResNet-18, a much deeper network that has already been trained on ImageNet (about 1.2 million images across 1,000 classes). Because ResNet-18 has already learned general visual features like edges, textures and shapes, I can use its convolutional layers as a fixed feature extractor and only train a new final layer for the ten CIFAR-10 classes. The question this script answers is how well those pre-trained features carry over to a new dataset when almost none of the network is retrained.</w:t>
       </w:r>
     </w:p>
     <w:p>
       <w:pPr>
-        <w:numPr>
-          <w:ilvl w:val="0"/>
-          <w:numId w:val="1001"/>
-        </w:numPr>
-        <w:pStyle w:val="Compact"/>
+        <w:pStyle w:val="BodyText"/>
       </w:pPr>
       <w:r>
-        <w:rPr>
-          <w:bCs/>
-          <w:b/>
-        </w:rPr>
-        <w:t xml:space="preserve">Freezing.</w:t>
-      </w:r>
-      <w:r>
-        <w:t xml:space="preserve"> </w:t>
-      </w:r>
-      <w:r>
-        <w:t xml:space="preserve">Setting</w:t>
-      </w:r>
-      <w:r>
-        <w:t xml:space="preserve"> </w:t>
-      </w:r>
-      <w:r>
-        <w:rPr>
-          <w:rStyle w:val="VerbatimChar"/>
-        </w:rPr>
-        <w:t xml:space="preserve">requires_grad = False</w:t>
-      </w:r>
-      <w:r>
-        <w:t xml:space="preserve"> </w:t>
-      </w:r>
-      <w:r>
-        <w:t xml:space="preserve">stops gradients from being computed for backbone weights, so they stay at their ImageNet values. Backpropagation is cheaper and the pre-trained features are preserved.</w:t>
+        <w:t xml:space="preserve">The model is built in build_model(). The assignment specifies torchvision.models.resnet18(pretrained=True), but the pretrained argument is deprecated in torchvision 0.13 and later, so I used the newer weights=ResNet18_Weights.IMAGENET1K_V1, which loads the same ImageNet weights. If an older version of torchvision is installed, the script falls back to pretrained=True. Next, a loop goes through every parameter in the model and sets requires_grad = False. This freezes the backbone, which means PyTorch does not compute gradients for those weights and the optimizer never changes them. Finally, I replaced the classification head. ResNet-18 ends with a fully connected layer, fc, that maps 512 features to the 1,000 ImageNet classes, so I swapped it for a new nn.Linear(512, 10). A newly created layer has requires_grad = True by default, so this new head is the only part of the network that trains:</w:t>
       </w:r>
     </w:p>
     <w:p>
       <w:pPr>
-        <w:numPr>
-          <w:ilvl w:val="0"/>
-          <w:numId w:val="1001"/>
-        </w:numPr>
-        <w:pStyle w:val="Compact"/>
+        <w:pStyle w:val="BodyText"/>
       </w:pPr>
       <w:r>
-        <w:rPr>
-          <w:bCs/>
-          <w:b/>
-        </w:rPr>
-        <w:t xml:space="preserve">New head.</w:t>
-      </w:r>
-      <w:r>
-        <w:t xml:space="preserve"> </w:t>
-      </w:r>
-      <w:r>
-        <w:t xml:space="preserve">A newly built</w:t>
-      </w:r>
-      <w:r>
-        <w:t xml:space="preserve"> </w:t>
-      </w:r>
-      <w:r>
-        <w:rPr>
-          <w:rStyle w:val="VerbatimChar"/>
-        </w:rPr>
-        <w:t xml:space="preserve">nn.Linear</w:t>
-      </w:r>
-      <w:r>
-        <w:t xml:space="preserve"> </w:t>
-      </w:r>
-      <w:r>
-        <w:t xml:space="preserve">has</w:t>
-      </w:r>
-      <w:r>
-        <w:t xml:space="preserve"> </w:t>
-      </w:r>
-      <w:r>
-        <w:rPr>
-          <w:rStyle w:val="VerbatimChar"/>
-        </w:rPr>
-        <w:t xml:space="preserve">requires_grad = True</w:t>
-      </w:r>
-      <w:r>
-        <w:t xml:space="preserve"> </w:t>
-      </w:r>
-      <w:r>
-        <w:t xml:space="preserve">by default, so it is the only part that trains: 512 × 10 + 10 = 5,130 parameters, versus about 11.18 million frozen.</w:t>
+        <w:t xml:space="preserve">New head = 512·10 + 10 = 5,130 trainable parameters</w:t>
+      </w:r>
+      <w:r>
+        <w:br/>
+      </w:r>
+      <w:r>
+        <w:t xml:space="preserve">Backbone = 11,176,512 frozen parameters</w:t>
       </w:r>
     </w:p>
     <w:p>
       <w:pPr>
-        <w:numPr>
-          <w:ilvl w:val="0"/>
-          <w:numId w:val="1001"/>
-        </w:numPr>
-        <w:pStyle w:val="Compact"/>
+        <w:pStyle w:val="BodyText"/>
       </w:pPr>
       <w:r>
-        <w:rPr>
-          <w:bCs/>
-          <w:b/>
-        </w:rPr>
-        <w:t xml:space="preserve">Optimizer.</w:t>
-      </w:r>
-      <w:r>
-        <w:t xml:space="preserve"> </w:t>
-      </w:r>
-      <w:r>
-        <w:t xml:space="preserve">Only</w:t>
-      </w:r>
-      <w:r>
-        <w:t xml:space="preserve"> </w:t>
-      </w:r>
-      <w:r>
-        <w:rPr>
-          <w:rStyle w:val="VerbatimChar"/>
-        </w:rPr>
-        <w:t xml:space="preserve">model.fc.parameters()</w:t>
-      </w:r>
-      <w:r>
-        <w:t xml:space="preserve"> </w:t>
-      </w:r>
-      <w:r>
-        <w:t xml:space="preserve">is passed to Adam.</w:t>
+        <w:t xml:space="preserve">That means only about 0.05% of the network’s weights are updated. The script prints both counts when it starts, which confirms that the freezing worked.</w:t>
       </w:r>
     </w:p>
     <w:p>
       <w:pPr>
-        <w:numPr>
-          <w:ilvl w:val="0"/>
-          <w:numId w:val="1001"/>
-        </w:numPr>
-        <w:pStyle w:val="Compact"/>
+        <w:pStyle w:val="BodyText"/>
       </w:pPr>
       <w:r>
-        <w:rPr>
-          <w:bCs/>
-          <w:b/>
-        </w:rPr>
-        <w:t xml:space="preserve">Preprocessing.</w:t>
-      </w:r>
-      <w:r>
-        <w:t xml:space="preserve"> </w:t>
-      </w:r>
-      <w:r>
-        <w:t xml:space="preserve">CIFAR-10 images are resized to 224 × 224 and normalized with ImageNet mean (0.485, 0.456, 0.406) and std (0.229, 0.224, 0.225) to match what the backbone saw in pre-training.</w:t>
+        <w:t xml:space="preserve">The data pipeline in get_loaders() is different from the custom CNN in two ways. First, each 32 × 32 CIFAR-10 image is resized to 224 × 224, because that is the image size ResNet-18 was trained on, and its features work best at that scale. Second, the images are normalized with the ImageNet mean (0.485, 0.456, 0.406) and standard deviation (0.229, 0.224, 0.225) instead of the CIFAR-10 values. The frozen backbone expects its inputs to have the same statistics it saw during pre-training. The training images also get a RandomHorizontalFlip(), and the batch size is 64 because the larger 224 × 224 images use much more memory.</w:t>
       </w:r>
     </w:p>
     <w:p>
       <w:pPr>
-        <w:numPr>
-          <w:ilvl w:val="0"/>
-          <w:numId w:val="1001"/>
-        </w:numPr>
-        <w:pStyle w:val="Compact"/>
+        <w:pStyle w:val="BodyText"/>
       </w:pPr>
       <w:r>
-        <w:rPr>
-          <w:bCs/>
-          <w:b/>
-        </w:rPr>
-        <w:t xml:space="preserve">Version note.</w:t>
-      </w:r>
-      <w:r>
-        <w:t xml:space="preserve"> </w:t>
-      </w:r>
-      <w:r>
-        <w:rPr>
-          <w:rStyle w:val="VerbatimChar"/>
-        </w:rPr>
-        <w:t xml:space="preserve">pretrained=True</w:t>
-      </w:r>
-      <w:r>
-        <w:t xml:space="preserve"> </w:t>
-      </w:r>
-      <w:r>
-        <w:t xml:space="preserve">is deprecated in torchvision 0.13 and later; the script uses the equivalent</w:t>
-      </w:r>
-      <w:r>
-        <w:t xml:space="preserve"> </w:t>
-      </w:r>
-      <w:r>
-        <w:rPr>
-          <w:rStyle w:val="VerbatimChar"/>
-        </w:rPr>
-        <w:t xml:space="preserve">weights=ResNet18_Weights.IMAGENET1K_V1</w:t>
-      </w:r>
-      <w:r>
-        <w:t xml:space="preserve"> </w:t>
-      </w:r>
-      <w:r>
-        <w:t xml:space="preserve">and falls back to</w:t>
-      </w:r>
-      <w:r>
-        <w:t xml:space="preserve"> </w:t>
-      </w:r>
-      <w:r>
-        <w:rPr>
-          <w:rStyle w:val="VerbatimChar"/>
-        </w:rPr>
-        <w:t xml:space="preserve">pretrained=True</w:t>
-      </w:r>
-      <w:r>
-        <w:t xml:space="preserve"> </w:t>
-      </w:r>
-      <w:r>
-        <w:t xml:space="preserve">on older versions.</w:t>
+        <w:t xml:space="preserve">Training and testing both run through one function, run_epoch(). When an optimizer is passed in, the model is put in training mode with gradients turned on, and each batch goes through the same steps as the custom CNN: forward pass, CrossEntropyLoss, zero_grad(), backward() and step(). When no optimizer is passed, the model is put in evaluation mode with gradients turned off, and the function only measures the loss and accuracy. I passed only model.fc.parameters() to the Adam optimizer (learning rate 0.001), which makes it clear that only the new head is being trained. Because only one linear layer is learning, 5 epochs is enough, and the final weights are saved to resnet18_transfer_cifar10.pth.</w:t>
       </w:r>
     </w:p>
     <w:p>
       <w:pPr>
-        <w:pStyle w:val="FirstParagraph"/>
+        <w:pStyle w:val="BodyText"/>
       </w:pPr>
       <w:r>
-        <w:t xml:space="preserve">To fine-tune further, unfreeze the last block (</w:t>
-      </w:r>
-      <w:r>
-        <w:rPr>
-          <w:rStyle w:val="VerbatimChar"/>
-        </w:rPr>
-        <w:t xml:space="preserve">model.layer4</w:t>
-      </w:r>
-      <w:r>
-        <w:t xml:space="preserve">) after the head converges and train it with a smaller learning rate (about 1e-4).</w:t>
+        <w:t xml:space="preserve">The main difference between the two scripts is where the features come from. The custom CNN has 620,362 parameters and has to learn all of its features from random starting weights, so it needs more epochs. The transfer learning model has about 11.18 million parameters in total, but only 5,130 of them train. It starts from strong general features and only has to learn a linear classifier on top of them, so it usually reaches good accuracy in far fewer epochs. The trade-off is that each step costs more, because every image has to pass through the whole ResNet-18 at 224 × 224 resolution. If the head alone were not accurate enough, the next step would be to unfreeze the last residual block (model.layer4) and fine-tune it with a smaller learning rate, around 0.0001.</w:t>
       </w:r>
     </w:p>
     <w:bookmarkEnd w:id="31"/>
     <w:bookmarkEnd w:id="32"/>
-    <w:sectPr/>
+    <w:sectPr>
+      <w:pgSz w:w="12240" w:h="15840"/>
+      <w:pgMar w:top="1440" w:right="1440" w:bottom="1440" w:left="1440" w:header="720" w:footer="720" w:gutter="0"/>
+    </w:sectPr>
   </w:body>
 </w:document>
 </file>
@@ -10220,87 +8711,8 @@
       </w:pPr>
     </w:lvl>
   </w:abstractNum>
-  <w:abstractNum w:abstractNumId="991">
-    <w:nsid w:val="A991"/>
-    <w:multiLevelType w:val="multilevel"/>
-    <w:lvl w:ilvl="0">
-      <w:numFmt w:val="bullet"/>
-      <w:lvlText w:val="•"/>
-      <w:lvlJc w:val="left"/>
-      <w:pPr>
-        <w:ind w:left="720" w:hanging="480"/>
-      </w:pPr>
-    </w:lvl>
-    <w:lvl w:ilvl="1">
-      <w:numFmt w:val="bullet"/>
-      <w:lvlText w:val="–"/>
-      <w:lvlJc w:val="left"/>
-      <w:pPr>
-        <w:ind w:left="1440" w:hanging="480"/>
-      </w:pPr>
-    </w:lvl>
-    <w:lvl w:ilvl="2">
-      <w:numFmt w:val="bullet"/>
-      <w:lvlText w:val="•"/>
-      <w:lvlJc w:val="left"/>
-      <w:pPr>
-        <w:ind w:left="2160" w:hanging="480"/>
-      </w:pPr>
-    </w:lvl>
-    <w:lvl w:ilvl="3">
-      <w:numFmt w:val="bullet"/>
-      <w:lvlText w:val="–"/>
-      <w:lvlJc w:val="left"/>
-      <w:pPr>
-        <w:ind w:left="2880" w:hanging="480"/>
-      </w:pPr>
-    </w:lvl>
-    <w:lvl w:ilvl="4">
-      <w:numFmt w:val="bullet"/>
-      <w:lvlText w:val="•"/>
-      <w:lvlJc w:val="left"/>
-      <w:pPr>
-        <w:ind w:left="3600" w:hanging="480"/>
-      </w:pPr>
-    </w:lvl>
-    <w:lvl w:ilvl="5">
-      <w:numFmt w:val="bullet"/>
-      <w:lvlText w:val="–"/>
-      <w:lvlJc w:val="left"/>
-      <w:pPr>
-        <w:ind w:left="4320" w:hanging="480"/>
-      </w:pPr>
-    </w:lvl>
-    <w:lvl w:ilvl="6">
-      <w:numFmt w:val="bullet"/>
-      <w:lvlText w:val="•"/>
-      <w:lvlJc w:val="left"/>
-      <w:pPr>
-        <w:ind w:left="5040" w:hanging="480"/>
-      </w:pPr>
-    </w:lvl>
-    <w:lvl w:ilvl="7">
-      <w:numFmt w:val="bullet"/>
-      <w:lvlText w:val="–"/>
-      <w:lvlJc w:val="left"/>
-      <w:pPr>
-        <w:ind w:left="5760" w:hanging="480"/>
-      </w:pPr>
-    </w:lvl>
-    <w:lvl w:ilvl="8">
-      <w:numFmt w:val="bullet"/>
-      <w:lvlText w:val="•"/>
-      <w:lvlJc w:val="left"/>
-      <w:pPr>
-        <w:ind w:left="6480" w:hanging="480"/>
-      </w:pPr>
-    </w:lvl>
-  </w:abstractNum>
   <w:num w:numId="1000">
     <w:abstractNumId w:val="990"/>
-  </w:num>
-  <w:num w:numId="1001">
-    <w:abstractNumId w:val="991"/>
   </w:num>
 </w:numbering>
 </file>
@@ -10310,7 +8722,7 @@
   <w:docDefaults>
     <w:rPrDefault>
       <w:rPr>
-        <w:rFonts w:asciiTheme="minorHAnsi" w:cstheme="minorBidi" w:eastAsiaTheme="minorHAnsi" w:hAnsiTheme="minorHAnsi"/>
+        <w:rFonts w:ascii="Times New Roman" w:cs="Times New Roman" w:eastAsia="Times New Roman" w:hAnsi="Times New Roman"/>
         <w:sz w:val="24"/>
         <w:szCs w:val="24"/>
         <w:lang w:bidi="ar-SA" w:eastAsia="en-US" w:val="en-US"/>
@@ -10318,7 +8730,7 @@
     </w:rPrDefault>
     <w:pPrDefault>
       <w:pPr>
-        <w:spacing w:after="200"/>
+        <w:spacing w:after="160" w:line="264" w:lineRule="auto"/>
       </w:pPr>
     </w:pPrDefault>
   </w:docDefaults>
@@ -10362,10 +8774,10 @@
       <w:jc w:val="center"/>
     </w:pPr>
     <w:rPr>
-      <w:rFonts w:asciiTheme="majorHAnsi" w:cstheme="majorBidi" w:eastAsiaTheme="majorEastAsia" w:hAnsiTheme="majorHAnsi"/>
+      <w:rFonts w:ascii="Times New Roman" w:cs="Times New Roman" w:eastAsia="Times New Roman" w:hAnsi="Times New Roman"/>
       <w:b/>
       <w:bCs/>
-      <w:color w:themeColor="accent1" w:themeShade="B5" w:val="345A8A"/>
+      <w:color w:val="000000"/>
       <w:sz w:val="36"/>
       <w:szCs w:val="36"/>
     </w:rPr>
@@ -10421,7 +8833,7 @@
       <w:sz w:val="20"/>
       <w:szCs w:val="20"/>
       <w:b/>
-      <w:color w:val="345A8A"/>
+      <w:color w:val="000000"/>
       &gt;
     </w:rPr>
   </w:style>
@@ -10461,12 +8873,12 @@
       <w:outlineLvl w:val="0"/>
     </w:pPr>
     <w:rPr>
-      <w:rFonts w:asciiTheme="majorHAnsi" w:cstheme="majorBidi" w:eastAsiaTheme="majorEastAsia" w:hAnsiTheme="majorHAnsi"/>
+      <w:rFonts w:ascii="Times New Roman" w:cs="Times New Roman" w:eastAsia="Times New Roman" w:hAnsi="Times New Roman"/>
       <w:b/>
       <w:bCs/>
-      <w:color w:themeColor="accent1" w:val="4F81BD"/>
-      <w:sz w:val="32"/>
-      <w:szCs w:val="32"/>
+      <w:color w:val="000000"/>
+      <w:sz w:val="28"/>
+      <w:szCs w:val="28"/>
     </w:rPr>
   </w:style>
   <w:style w:styleId="Heading2" w:type="paragraph">
@@ -10483,12 +8895,12 @@
       <w:outlineLvl w:val="1"/>
     </w:pPr>
     <w:rPr>
-      <w:rFonts w:asciiTheme="majorHAnsi" w:cstheme="majorBidi" w:eastAsiaTheme="majorEastAsia" w:hAnsiTheme="majorHAnsi"/>
+      <w:rFonts w:ascii="Times New Roman" w:cs="Times New Roman" w:eastAsia="Times New Roman" w:hAnsi="Times New Roman"/>
       <w:b/>
       <w:bCs/>
-      <w:color w:themeColor="accent1" w:val="4F81BD"/>
-      <w:sz w:val="28"/>
-      <w:szCs w:val="28"/>
+      <w:color w:val="000000"/>
+      <w:sz w:val="24"/>
+      <w:szCs w:val="24"/>
     </w:rPr>
   </w:style>
   <w:style w:styleId="Heading3" w:type="paragraph">
@@ -10505,10 +8917,10 @@
       <w:outlineLvl w:val="2"/>
     </w:pPr>
     <w:rPr>
-      <w:rFonts w:asciiTheme="majorHAnsi" w:cstheme="majorBidi" w:eastAsiaTheme="majorEastAsia" w:hAnsiTheme="majorHAnsi"/>
+      <w:rFonts w:ascii="Times New Roman" w:cs="Times New Roman" w:eastAsia="Times New Roman" w:hAnsi="Times New Roman"/>
       <w:b/>
       <w:bCs/>
-      <w:color w:themeColor="accent1" w:val="4F81BD"/>
+      <w:color w:val="000000"/>
       <w:sz w:val="24"/>
       <w:szCs w:val="24"/>
     </w:rPr>
@@ -10527,10 +8939,10 @@
       <w:outlineLvl w:val="3"/>
     </w:pPr>
     <w:rPr>
-      <w:rFonts w:asciiTheme="majorHAnsi" w:cstheme="majorBidi" w:eastAsiaTheme="majorEastAsia" w:hAnsiTheme="majorHAnsi"/>
+      <w:rFonts w:ascii="Times New Roman" w:cs="Times New Roman" w:eastAsia="Times New Roman" w:hAnsi="Times New Roman"/>
       <w:i/>
       <w:bCs/>
-      <w:color w:themeColor="accent1" w:val="4F81BD"/>
+      <w:color w:val="000000"/>
       <w:sz w:val="24"/>
       <w:szCs w:val="24"/>
     </w:rPr>
@@ -10549,9 +8961,9 @@
       <w:outlineLvl w:val="4"/>
     </w:pPr>
     <w:rPr>
-      <w:rFonts w:asciiTheme="majorHAnsi" w:cstheme="majorBidi" w:eastAsiaTheme="majorEastAsia" w:hAnsiTheme="majorHAnsi"/>
+      <w:rFonts w:ascii="Times New Roman" w:cs="Times New Roman" w:eastAsia="Times New Roman" w:hAnsi="Times New Roman"/>
       <w:iCs/>
-      <w:color w:themeColor="accent1" w:val="4F81BD"/>
+      <w:color w:val="000000"/>
       <w:sz w:val="24"/>
       <w:szCs w:val="24"/>
     </w:rPr>
@@ -10570,8 +8982,8 @@
       <w:outlineLvl w:val="5"/>
     </w:pPr>
     <w:rPr>
-      <w:rFonts w:asciiTheme="majorHAnsi" w:cstheme="majorBidi" w:eastAsiaTheme="majorEastAsia" w:hAnsiTheme="majorHAnsi"/>
-      <w:color w:themeColor="accent1" w:val="4F81BD"/>
+      <w:rFonts w:ascii="Times New Roman" w:cs="Times New Roman" w:eastAsia="Times New Roman" w:hAnsi="Times New Roman"/>
+      <w:color w:val="000000"/>
       <w:sz w:val="24"/>
       <w:szCs w:val="24"/>
     </w:rPr>
@@ -10590,8 +9002,8 @@
       <w:outlineLvl w:val="6"/>
     </w:pPr>
     <w:rPr>
-      <w:rFonts w:asciiTheme="majorHAnsi" w:cstheme="majorBidi" w:eastAsiaTheme="majorEastAsia" w:hAnsiTheme="majorHAnsi"/>
-      <w:color w:themeColor="accent1" w:val="4F81BD"/>
+      <w:rFonts w:ascii="Times New Roman" w:cs="Times New Roman" w:eastAsia="Times New Roman" w:hAnsi="Times New Roman"/>
+      <w:color w:val="000000"/>
       <w:sz w:val="24"/>
       <w:szCs w:val="24"/>
     </w:rPr>
@@ -10610,8 +9022,8 @@
       <w:outlineLvl w:val="7"/>
     </w:pPr>
     <w:rPr>
-      <w:rFonts w:asciiTheme="majorHAnsi" w:cstheme="majorBidi" w:eastAsiaTheme="majorEastAsia" w:hAnsiTheme="majorHAnsi"/>
-      <w:color w:themeColor="accent1" w:val="4F81BD"/>
+      <w:rFonts w:ascii="Times New Roman" w:cs="Times New Roman" w:eastAsia="Times New Roman" w:hAnsi="Times New Roman"/>
+      <w:color w:val="000000"/>
       <w:sz w:val="24"/>
       <w:szCs w:val="24"/>
     </w:rPr>
@@ -10630,8 +9042,8 @@
       <w:outlineLvl w:val="8"/>
     </w:pPr>
     <w:rPr>
-      <w:rFonts w:asciiTheme="majorHAnsi" w:cstheme="majorBidi" w:eastAsiaTheme="majorEastAsia" w:hAnsiTheme="majorHAnsi"/>
-      <w:color w:themeColor="accent1" w:val="4F81BD"/>
+      <w:rFonts w:ascii="Times New Roman" w:cs="Times New Roman" w:eastAsia="Times New Roman" w:hAnsi="Times New Roman"/>
+      <w:color w:val="000000"/>
       <w:sz w:val="24"/>
       <w:szCs w:val="24"/>
     </w:rPr>
@@ -10770,7 +9182,7 @@
     <w:name w:val="Hyperlink"/>
     <w:basedOn w:val="BodyTextChar"/>
     <w:rPr>
-      <w:color w:themeColor="accent1" w:val="4F81BD"/>
+      <w:color w:val="000000"/>
     </w:rPr>
   </w:style>
   <w:style w:styleId="TOCHeading" w:type="paragraph">
@@ -10785,10 +9197,10 @@
       <w:outlineLvl w:val="9"/>
     </w:pPr>
     <w:rPr>
-      <w:rFonts w:asciiTheme="majorHAnsi" w:cstheme="majorBidi" w:eastAsiaTheme="majorEastAsia" w:hAnsiTheme="majorHAnsi"/>
+      <w:rFonts w:ascii="Times New Roman" w:cs="Times New Roman" w:eastAsia="Times New Roman" w:hAnsi="Times New Roman"/>
       <w:b w:val="0"/>
       <w:bCs w:val="0"/>
-      <w:color w:themeColor="accent1" w:themeShade="BF" w:val="365F91"/>
+      <w:color w:val="000000"/>
     </w:rPr>
   </w:style>
   <w:style w:type="paragraph" w:customStyle="1" w:styleId="SourceCode">

</xml_diff>

<commit_message>
Homework 4: restore original Part III in solutions, keep new formatting
Co-Authored-By: Claude Opus 5.5 <noreply@anthropic.com>
Claude-Session: https://claude.ai/code/session_01ENZyqHAgTpUW2Q2njnQYSM
</commit_message>
<xml_diff>
--- a/homework/Homework_4/ENG6010_HW4_Solutions.docx
+++ b/homework/Homework_4/ENG6010_HW4_Solutions.docx
@@ -8417,13 +8417,54 @@
         <w:t xml:space="preserve">Part III: Programming &amp; Implementation (30 pts)</w:t>
       </w:r>
     </w:p>
-    <w:bookmarkStart w:id="30" w:name="Xbd6f46ea9bbfbff696ae7b9f0f015f883b622cb"/>
+    <w:p>
+      <w:pPr>
+        <w:pStyle w:val="FirstParagraph"/>
+      </w:pPr>
+      <w:r>
+        <w:t xml:space="preserve">Two scripts are submitted with this document:</w:t>
+      </w:r>
+      <w:r>
+        <w:t xml:space="preserve"> </w:t>
+      </w:r>
+      <w:r>
+        <w:rPr>
+          <w:rStyle w:val="VerbatimChar"/>
+        </w:rPr>
+        <w:t xml:space="preserve">custom_cnn.py</w:t>
+      </w:r>
+      <w:r>
+        <w:t xml:space="preserve"> </w:t>
+      </w:r>
+      <w:r>
+        <w:t xml:space="preserve">and</w:t>
+      </w:r>
+      <w:r>
+        <w:t xml:space="preserve"> </w:t>
+      </w:r>
+      <w:r>
+        <w:rPr>
+          <w:rStyle w:val="VerbatimChar"/>
+        </w:rPr>
+        <w:t xml:space="preserve">transfer_learning_resnet18.py</w:t>
+      </w:r>
+      <w:r>
+        <w:t xml:space="preserve">. Both train on CIFAR-10 and print loss</w:t>
+      </w:r>
+      <w:r>
+        <w:t xml:space="preserve"> </w:t>
+      </w:r>
+      <w:r>
+        <w:t xml:space="preserve">and accuracy per epoch.</w:t>
+      </w:r>
+    </w:p>
+    <w:bookmarkStart w:id="30" w:name="a-custom-3-layer-cnn-custom_cnn.py"/>
     <w:p>
       <w:pPr>
         <w:pStyle w:val="Heading2"/>
       </w:pPr>
       <w:r>
-        <w:t xml:space="preserve">Program Explanation: Custom 3-Layer CNN (custom_cnn.py)</w:t>
+        <w:t xml:space="preserve">(a) Custom 3-layer CNN (custom_cnn.py)</w:t>
       </w:r>
     </w:p>
     <w:p>
@@ -8431,111 +8472,672 @@
         <w:pStyle w:val="FirstParagraph"/>
       </w:pPr>
       <w:r>
-        <w:t xml:space="preserve">This program builds a convolutional neural network from scratch in PyTorch and trains it to classify images from the CIFAR-10 dataset. It uses the three layer types the problem asks for: nn.Conv2d, nn.MaxPool2d and nn.Linear. CIFAR-10 contains 60,000 small color images (32 × 32 pixels) split across ten classes: airplane, automobile, bird, cat, deer, dog, frog, horse, ship and truck. The question this script answers is how well a small network can learn to recognize these classes when every weight starts out random and the network has to learn every feature on its own.</w:t>
+        <w:t xml:space="preserve">The starter template is extended to three conv blocks (Conv → ReLU →</w:t>
+      </w:r>
+      <w:r>
+        <w:t xml:space="preserve"> </w:t>
+      </w:r>
+      <w:r>
+        <w:t xml:space="preserve">MaxPool), so a 32 × 32 image shrinks to 16, 8, then 4 pixels per side</w:t>
+      </w:r>
+      <w:r>
+        <w:t xml:space="preserve"> </w:t>
+      </w:r>
+      <w:r>
+        <w:t xml:space="preserve">before the classifier.</w:t>
       </w:r>
     </w:p>
+    <w:p>
+      <w:pPr>
+        <w:pStyle w:val="SourceCode"/>
+      </w:pPr>
+      <w:r>
+        <w:rPr>
+          <w:rStyle w:val="VerbatimChar"/>
+        </w:rPr>
+        <w:t xml:space="preserve">class CustomCNN(nn.Module):</w:t>
+      </w:r>
+      <w:r>
+        <w:br/>
+      </w:r>
+      <w:r>
+        <w:rPr>
+          <w:rStyle w:val="VerbatimChar"/>
+        </w:rPr>
+        <w:t xml:space="preserve">    def __init__(self, num_classes=10):</w:t>
+      </w:r>
+      <w:r>
+        <w:br/>
+      </w:r>
+      <w:r>
+        <w:rPr>
+          <w:rStyle w:val="VerbatimChar"/>
+        </w:rPr>
+        <w:t xml:space="preserve">        super(CustomCNN, self).__init__()</w:t>
+      </w:r>
+      <w:r>
+        <w:br/>
+      </w:r>
+      <w:r>
+        <w:rPr>
+          <w:rStyle w:val="VerbatimChar"/>
+        </w:rPr>
+        <w:t xml:space="preserve">        self.conv1 = nn.Conv2d(3, 32, kernel_size=3, padding=1)</w:t>
+      </w:r>
+      <w:r>
+        <w:br/>
+      </w:r>
+      <w:r>
+        <w:rPr>
+          <w:rStyle w:val="VerbatimChar"/>
+        </w:rPr>
+        <w:t xml:space="preserve">        self.conv2 = nn.Conv2d(32, 64, kernel_size=3, padding=1)</w:t>
+      </w:r>
+      <w:r>
+        <w:br/>
+      </w:r>
+      <w:r>
+        <w:rPr>
+          <w:rStyle w:val="VerbatimChar"/>
+        </w:rPr>
+        <w:t xml:space="preserve">        self.conv3 = nn.Conv2d(64, 128, kernel_size=3, padding=1)</w:t>
+      </w:r>
+      <w:r>
+        <w:br/>
+      </w:r>
+      <w:r>
+        <w:rPr>
+          <w:rStyle w:val="VerbatimChar"/>
+        </w:rPr>
+        <w:t xml:space="preserve">        self.pool = nn.MaxPool2d(kernel_size=2, stride=2)</w:t>
+      </w:r>
+      <w:r>
+        <w:br/>
+      </w:r>
+      <w:r>
+        <w:rPr>
+          <w:rStyle w:val="VerbatimChar"/>
+        </w:rPr>
+        <w:t xml:space="preserve">        self.dropout = nn.Dropout(0.3)</w:t>
+      </w:r>
+      <w:r>
+        <w:br/>
+      </w:r>
+      <w:r>
+        <w:rPr>
+          <w:rStyle w:val="VerbatimChar"/>
+        </w:rPr>
+        <w:t xml:space="preserve">        self.fc1 = nn.Linear(128 * 4 * 4, 256)</w:t>
+      </w:r>
+      <w:r>
+        <w:br/>
+      </w:r>
+      <w:r>
+        <w:rPr>
+          <w:rStyle w:val="VerbatimChar"/>
+        </w:rPr>
+        <w:t xml:space="preserve">        self.fc2 = nn.Linear(256, num_classes)</w:t>
+      </w:r>
+      <w:r>
+        <w:br/>
+      </w:r>
+      <w:r>
+        <w:br/>
+      </w:r>
+      <w:r>
+        <w:rPr>
+          <w:rStyle w:val="VerbatimChar"/>
+        </w:rPr>
+        <w:t xml:space="preserve">    def forward(self, x):</w:t>
+      </w:r>
+      <w:r>
+        <w:br/>
+      </w:r>
+      <w:r>
+        <w:rPr>
+          <w:rStyle w:val="VerbatimChar"/>
+        </w:rPr>
+        <w:t xml:space="preserve">        x = self.pool(F.relu(self.conv1(x)))   # 32 x 16 x 16</w:t>
+      </w:r>
+      <w:r>
+        <w:br/>
+      </w:r>
+      <w:r>
+        <w:rPr>
+          <w:rStyle w:val="VerbatimChar"/>
+        </w:rPr>
+        <w:t xml:space="preserve">        x = self.pool(F.relu(self.conv2(x)))   # 64 x 8 x 8</w:t>
+      </w:r>
+      <w:r>
+        <w:br/>
+      </w:r>
+      <w:r>
+        <w:rPr>
+          <w:rStyle w:val="VerbatimChar"/>
+        </w:rPr>
+        <w:t xml:space="preserve">        x = self.pool(F.relu(self.conv3(x)))   # 128 x 4 x 4</w:t>
+      </w:r>
+      <w:r>
+        <w:br/>
+      </w:r>
+      <w:r>
+        <w:rPr>
+          <w:rStyle w:val="VerbatimChar"/>
+        </w:rPr>
+        <w:t xml:space="preserve">        x = x.view(x.size(0), -1)</w:t>
+      </w:r>
+      <w:r>
+        <w:br/>
+      </w:r>
+      <w:r>
+        <w:rPr>
+          <w:rStyle w:val="VerbatimChar"/>
+        </w:rPr>
+        <w:t xml:space="preserve">        x = self.dropout(F.relu(self.fc1(x)))</w:t>
+      </w:r>
+      <w:r>
+        <w:br/>
+      </w:r>
+      <w:r>
+        <w:rPr>
+          <w:rStyle w:val="VerbatimChar"/>
+        </w:rPr>
+        <w:t xml:space="preserve">        return self.fc2(x)                     # logits</w:t>
+      </w:r>
+      <w:r>
+        <w:br/>
+      </w:r>
+      <w:r>
+        <w:br/>
+      </w:r>
+      <w:r>
+        <w:rPr>
+          <w:rStyle w:val="VerbatimChar"/>
+        </w:rPr>
+        <w:t xml:space="preserve">criterion = nn.CrossEntropyLoss()</w:t>
+      </w:r>
+      <w:r>
+        <w:br/>
+      </w:r>
+      <w:r>
+        <w:rPr>
+          <w:rStyle w:val="VerbatimChar"/>
+        </w:rPr>
+        <w:t xml:space="preserve">optimizer = torch.optim.Adam(model.parameters(), lr=1e-3)</w:t>
+      </w:r>
+    </w:p>
+    <w:tbl>
+      <w:tblPr>
+        <w:tblStyle w:val="Table"/>
+        <w:tblW w:type="pct" w:w="4865"/>
+        <w:tblLook w:firstRow="1" w:lastRow="0" w:firstColumn="0" w:lastColumn="0" w:noHBand="0" w:noVBand="0" w:val="0020"/>
+        <w:jc w:val="start"/>
+      </w:tblPr>
+      <w:tblGrid>
+        <w:gridCol w:w="2568"/>
+        <w:gridCol w:w="2568"/>
+        <w:gridCol w:w="2568"/>
+      </w:tblGrid>
+      <w:tr>
+        <w:trPr>
+          <w:tblHeader w:val="true"/>
+        </w:trPr>
+        <w:tc>
+          <w:tcPr/>
+          <w:p>
+            <w:pPr>
+              <w:pStyle w:val="Compact"/>
+              <w:jc w:val="left"/>
+            </w:pPr>
+            <w:r>
+              <w:t xml:space="preserve">Layer</w:t>
+            </w:r>
+          </w:p>
+        </w:tc>
+        <w:tc>
+          <w:tcPr/>
+          <w:p>
+            <w:pPr>
+              <w:pStyle w:val="Compact"/>
+              <w:jc w:val="left"/>
+            </w:pPr>
+            <w:r>
+              <w:t xml:space="preserve">Output shape</w:t>
+            </w:r>
+          </w:p>
+        </w:tc>
+        <w:tc>
+          <w:tcPr/>
+          <w:p>
+            <w:pPr>
+              <w:pStyle w:val="Compact"/>
+              <w:jc w:val="left"/>
+            </w:pPr>
+            <w:r>
+              <w:t xml:space="preserve">Parameters</w:t>
+            </w:r>
+          </w:p>
+        </w:tc>
+      </w:tr>
+      <w:tr>
+        <w:tc>
+          <w:tcPr/>
+          <w:p>
+            <w:pPr>
+              <w:pStyle w:val="Compact"/>
+              <w:jc w:val="left"/>
+            </w:pPr>
+            <w:r>
+              <w:t xml:space="preserve">conv1 + pool</w:t>
+            </w:r>
+          </w:p>
+        </w:tc>
+        <w:tc>
+          <w:tcPr/>
+          <w:p>
+            <w:pPr>
+              <w:pStyle w:val="Compact"/>
+              <w:jc w:val="left"/>
+            </w:pPr>
+            <w:r>
+              <w:t xml:space="preserve">32 × 16 × 16</w:t>
+            </w:r>
+          </w:p>
+        </w:tc>
+        <w:tc>
+          <w:tcPr/>
+          <w:p>
+            <w:pPr>
+              <w:pStyle w:val="Compact"/>
+              <w:jc w:val="left"/>
+            </w:pPr>
+            <w:r>
+              <w:t xml:space="preserve">(3·3·3 + 1)·32 = 896</w:t>
+            </w:r>
+          </w:p>
+        </w:tc>
+      </w:tr>
+      <w:tr>
+        <w:tc>
+          <w:tcPr/>
+          <w:p>
+            <w:pPr>
+              <w:pStyle w:val="Compact"/>
+              <w:jc w:val="left"/>
+            </w:pPr>
+            <w:r>
+              <w:t xml:space="preserve">conv2 + pool</w:t>
+            </w:r>
+          </w:p>
+        </w:tc>
+        <w:tc>
+          <w:tcPr/>
+          <w:p>
+            <w:pPr>
+              <w:pStyle w:val="Compact"/>
+              <w:jc w:val="left"/>
+            </w:pPr>
+            <w:r>
+              <w:t xml:space="preserve">64 × 8 × 8</w:t>
+            </w:r>
+          </w:p>
+        </w:tc>
+        <w:tc>
+          <w:tcPr/>
+          <w:p>
+            <w:pPr>
+              <w:pStyle w:val="Compact"/>
+              <w:jc w:val="left"/>
+            </w:pPr>
+            <w:r>
+              <w:t xml:space="preserve">(3·3·32 + 1)·64 =</w:t>
+            </w:r>
+            <w:r>
+              <w:t xml:space="preserve"> </w:t>
+            </w:r>
+            <w:r>
+              <w:t xml:space="preserve">18,496</w:t>
+            </w:r>
+          </w:p>
+        </w:tc>
+      </w:tr>
+      <w:tr>
+        <w:tc>
+          <w:tcPr/>
+          <w:p>
+            <w:pPr>
+              <w:pStyle w:val="Compact"/>
+              <w:jc w:val="left"/>
+            </w:pPr>
+            <w:r>
+              <w:t xml:space="preserve">conv3 + pool</w:t>
+            </w:r>
+          </w:p>
+        </w:tc>
+        <w:tc>
+          <w:tcPr/>
+          <w:p>
+            <w:pPr>
+              <w:pStyle w:val="Compact"/>
+              <w:jc w:val="left"/>
+            </w:pPr>
+            <w:r>
+              <w:t xml:space="preserve">128 × 4 × 4</w:t>
+            </w:r>
+          </w:p>
+        </w:tc>
+        <w:tc>
+          <w:tcPr/>
+          <w:p>
+            <w:pPr>
+              <w:pStyle w:val="Compact"/>
+              <w:jc w:val="left"/>
+            </w:pPr>
+            <w:r>
+              <w:t xml:space="preserve">(3·3·64 + 1)·128 =</w:t>
+            </w:r>
+            <w:r>
+              <w:t xml:space="preserve"> </w:t>
+            </w:r>
+            <w:r>
+              <w:t xml:space="preserve">73,856</w:t>
+            </w:r>
+          </w:p>
+        </w:tc>
+      </w:tr>
+      <w:tr>
+        <w:tc>
+          <w:tcPr/>
+          <w:p>
+            <w:pPr>
+              <w:pStyle w:val="Compact"/>
+              <w:jc w:val="left"/>
+            </w:pPr>
+            <w:r>
+              <w:t xml:space="preserve">fc1</w:t>
+            </w:r>
+          </w:p>
+        </w:tc>
+        <w:tc>
+          <w:tcPr/>
+          <w:p>
+            <w:pPr>
+              <w:pStyle w:val="Compact"/>
+              <w:jc w:val="left"/>
+            </w:pPr>
+            <w:r>
+              <w:t xml:space="preserve">256</w:t>
+            </w:r>
+          </w:p>
+        </w:tc>
+        <w:tc>
+          <w:tcPr/>
+          <w:p>
+            <w:pPr>
+              <w:pStyle w:val="Compact"/>
+              <w:jc w:val="left"/>
+            </w:pPr>
+            <w:r>
+              <w:t xml:space="preserve">2,048·256 + 256 =</w:t>
+            </w:r>
+            <w:r>
+              <w:t xml:space="preserve"> </w:t>
+            </w:r>
+            <w:r>
+              <w:t xml:space="preserve">524,544</w:t>
+            </w:r>
+          </w:p>
+        </w:tc>
+      </w:tr>
+      <w:tr>
+        <w:tc>
+          <w:tcPr/>
+          <w:p>
+            <w:pPr>
+              <w:pStyle w:val="Compact"/>
+              <w:jc w:val="left"/>
+            </w:pPr>
+            <w:r>
+              <w:t xml:space="preserve">fc2</w:t>
+            </w:r>
+          </w:p>
+        </w:tc>
+        <w:tc>
+          <w:tcPr/>
+          <w:p>
+            <w:pPr>
+              <w:pStyle w:val="Compact"/>
+              <w:jc w:val="left"/>
+            </w:pPr>
+            <w:r>
+              <w:t xml:space="preserve">10</w:t>
+            </w:r>
+          </w:p>
+        </w:tc>
+        <w:tc>
+          <w:tcPr/>
+          <w:p>
+            <w:pPr>
+              <w:pStyle w:val="Compact"/>
+              <w:jc w:val="left"/>
+            </w:pPr>
+            <w:r>
+              <w:t xml:space="preserve">256·10 + 10 = 2,570</w:t>
+            </w:r>
+          </w:p>
+        </w:tc>
+      </w:tr>
+      <w:tr>
+        <w:tc>
+          <w:tcPr/>
+          <w:p>
+            <w:pPr>
+              <w:pStyle w:val="Compact"/>
+              <w:jc w:val="left"/>
+            </w:pPr>
+            <w:r>
+              <w:rPr>
+                <w:bCs/>
+                <w:b/>
+              </w:rPr>
+              <w:t xml:space="preserve">Total</w:t>
+            </w:r>
+          </w:p>
+        </w:tc>
+        <w:tc>
+          <w:tcPr/>
+          <w:p>
+            <w:pPr>
+              <w:pStyle w:val="Compact"/>
+            </w:pPr>
+          </w:p>
+        </w:tc>
+        <w:tc>
+          <w:tcPr/>
+          <w:p>
+            <w:pPr>
+              <w:pStyle w:val="Compact"/>
+              <w:jc w:val="left"/>
+            </w:pPr>
+            <w:r>
+              <w:rPr>
+                <w:bCs/>
+                <w:b/>
+              </w:rPr>
+              <w:t xml:space="preserve">620,362</w:t>
+            </w:r>
+          </w:p>
+        </w:tc>
+      </w:tr>
+    </w:tbl>
     <w:p>
       <w:pPr>
         <w:pStyle w:val="BodyText"/>
       </w:pPr>
       <w:r>
-        <w:t xml:space="preserve">The starter template in the assignment only had two convolutional layers, so I added a third one (conv3) to meet the three-layer requirement. Each convolutional block runs the image through a 3 × 3 convolution with padding of 1, then a ReLU activation, then a 2 × 2 max pool with a stride of 2. The padding keeps the width and height the same through the convolution, and the pool cuts them in half. Because of that, a 32 × 32 image shrinks to 16 × 16, then 8 × 8, then 4 × 4, while the number of channels doubles from 32 to 64 to 128. This trades spatial detail for more feature channels as the network goes deeper, so the early layers pick up simple edges and the later layers pick up larger shapes and textures. Adding the third block also changed the input size of the first fully connected layer from 64 × 8 × 8 in the template to 128 × 4 × 4 = 2,048.</w:t>
-      </w:r>
-    </w:p>
-    <w:p>
-      <w:pPr>
-        <w:pStyle w:val="BodyText"/>
-      </w:pPr>
-      <w:r>
-        <w:t xml:space="preserve">After the last pool, x.view() flattens the 128 × 4 × 4 output into a vector of 2,048 values. That vector goes through fc1, which has 256 neurons followed by ReLU, and then fc2, which has 10 outputs, one per class. I put a Dropout of 0.3 after fc1, which randomly turns off 30% of those neurons during training so the network does not rely too heavily on any one of them and overfits less. The forward() function returns raw scores (logits) instead of probabilities because nn.CrossEntropyLoss already applies the softmax internally, and adding another softmax in the model would apply it twice. Using the parameter formula from Part I, the learnable parameters in each layer are:</w:t>
-      </w:r>
-    </w:p>
-    <w:p>
-      <w:pPr>
-        <w:pStyle w:val="BodyText"/>
-      </w:pPr>
-      <w:r>
-        <w:t xml:space="preserve">conv1 = (3·3·3 + 1)·32 = 896</w:t>
-      </w:r>
-      <w:r>
-        <w:br/>
-      </w:r>
-      <w:r>
-        <w:t xml:space="preserve">conv2 = (3·3·32 + 1)·64 = 18,496</w:t>
-      </w:r>
-      <w:r>
-        <w:br/>
-      </w:r>
-      <w:r>
-        <w:t xml:space="preserve">conv3 = (3·3·64 + 1)·128 = 73,856</w:t>
-      </w:r>
-      <w:r>
-        <w:br/>
-      </w:r>
-      <w:r>
-        <w:t xml:space="preserve">fc1 = 2,048·256 + 256 = 524,544</w:t>
-      </w:r>
-      <w:r>
-        <w:br/>
-      </w:r>
-      <w:r>
-        <w:t xml:space="preserve">fc2 = 256·10 + 10 = 2,570</w:t>
-      </w:r>
-      <w:r>
-        <w:br/>
-      </w:r>
-      <w:r>
-        <w:t xml:space="preserve">Total = 620,362</w:t>
-      </w:r>
-    </w:p>
-    <w:p>
-      <w:pPr>
-        <w:pStyle w:val="BodyText"/>
-      </w:pPr>
-      <w:r>
-        <w:t xml:space="preserve">About 85% of all the parameters are in fc1. This is the same point from Part I: the convolutional layers share their weights across the whole image, while the fully connected layer needs a separate weight for every input and output pair.</w:t>
-      </w:r>
-    </w:p>
-    <w:p>
-      <w:pPr>
-        <w:pStyle w:val="BodyText"/>
-      </w:pPr>
-      <w:r>
-        <w:t xml:space="preserve">The data is loaded in get_loaders(). Every image is normalized with the CIFAR-10 channel mean (0.4914, 0.4822, 0.4465) and standard deviation (0.2470, 0.2435, 0.2616) so the inputs are centered near zero, which makes training faster and more stable. For the training images only, I added RandomCrop(32, padding=4) and RandomHorizontalFlip(), so the network sees slightly shifted and mirrored versions of each picture and generalizes better. The 10,000 test images are not augmented, so the test accuracy is measured on the original images. The data is fed in batches of 128, which gives 391 weight updates per epoch over the 50,000 training images.</w:t>
-      </w:r>
-    </w:p>
-    <w:p>
-      <w:pPr>
-        <w:pStyle w:val="BodyText"/>
-      </w:pPr>
-      <w:r>
-        <w:t xml:space="preserve">Training happens in train_one_epoch(), which runs the same five steps on every batch. First, optimizer.zero_grad() clears the gradients from the previous batch, since PyTorch adds new gradients to the old ones by default. Second, the forward pass sends the images through the model. Third, CrossEntropyLoss compares the predicted scores to the true labels. Fourth, loss.backward() runs backpropagation to find the gradient of the loss with respect to every weight. Fifth, optimizer.step() updates the weights using the Adam optimizer with a learning rate of 0.001. Adam keeps a running average of each weight’s gradient and its variance, so every weight gets its own step size. The cross-entropy loss for one image is:</w:t>
-      </w:r>
-    </w:p>
-    <w:p>
-      <w:pPr>
-        <w:pStyle w:val="BodyText"/>
-      </w:pPr>
-      <w:r>
-        <w:t xml:space="preserve">Loss = −log( e^(z_y) / Σ_j e^(z_j) )</w:t>
-      </w:r>
-    </w:p>
-    <w:p>
-      <w:pPr>
-        <w:pStyle w:val="BodyText"/>
-      </w:pPr>
-      <w:r>
-        <w:t xml:space="preserve">where z_j is the score for class j and y is the correct class. After each epoch, evaluate() runs the model on the test set with model.eval() and torch.no_grad(), which turns dropout off and stops gradient tracking so evaluation is faster and gives the same answer every time. I kept torch.manual_seed(42) so the results are reproducible. The script trains for 15 epochs, prints the training and test loss and accuracy after each one, and saves the final weights to custom_cnn_cifar10.pth.</w:t>
+        <w:t xml:space="preserve">Each training step runs</w:t>
+      </w:r>
+      <w:r>
+        <w:t xml:space="preserve"> </w:t>
+      </w:r>
+      <w:r>
+        <w:rPr>
+          <w:rStyle w:val="VerbatimChar"/>
+        </w:rPr>
+        <w:t xml:space="preserve">zero_grad()</w:t>
+      </w:r>
+      <w:r>
+        <w:t xml:space="preserve"> </w:t>
+      </w:r>
+      <w:r>
+        <w:t xml:space="preserve">→ forward →</w:t>
+      </w:r>
+      <w:r>
+        <w:t xml:space="preserve"> </w:t>
+      </w:r>
+      <w:r>
+        <w:rPr>
+          <w:rStyle w:val="VerbatimChar"/>
+        </w:rPr>
+        <w:t xml:space="preserve">CrossEntropyLoss</w:t>
+      </w:r>
+      <w:r>
+        <w:t xml:space="preserve"> </w:t>
+      </w:r>
+      <w:r>
+        <w:t xml:space="preserve">→</w:t>
+      </w:r>
+      <w:r>
+        <w:t xml:space="preserve"> </w:t>
+      </w:r>
+      <w:r>
+        <w:rPr>
+          <w:rStyle w:val="VerbatimChar"/>
+        </w:rPr>
+        <w:t xml:space="preserve">backward()</w:t>
+      </w:r>
+      <w:r>
+        <w:t xml:space="preserve"> </w:t>
+      </w:r>
+      <w:r>
+        <w:t xml:space="preserve">→</w:t>
+      </w:r>
+      <w:r>
+        <w:t xml:space="preserve"> </w:t>
+      </w:r>
+      <w:r>
+        <w:rPr>
+          <w:rStyle w:val="VerbatimChar"/>
+        </w:rPr>
+        <w:t xml:space="preserve">optimizer.step()</w:t>
+      </w:r>
+      <w:r>
+        <w:t xml:space="preserve">. The model outputs raw logits because</w:t>
+      </w:r>
+      <w:r>
+        <w:t xml:space="preserve"> </w:t>
+      </w:r>
+      <w:r>
+        <w:rPr>
+          <w:rStyle w:val="VerbatimChar"/>
+        </w:rPr>
+        <w:t xml:space="preserve">CrossEntropyLoss</w:t>
+      </w:r>
+      <w:r>
+        <w:t xml:space="preserve"> </w:t>
+      </w:r>
+      <w:r>
+        <w:t xml:space="preserve">applies log-softmax internally. Training uses random</w:t>
+      </w:r>
+      <w:r>
+        <w:t xml:space="preserve"> </w:t>
+      </w:r>
+      <w:r>
+        <w:t xml:space="preserve">crop and horizontal flip augmentation, 15 epochs, batch size 128.</w:t>
       </w:r>
     </w:p>
     <w:bookmarkEnd w:id="30"/>
-    <w:bookmarkStart w:id="31" w:name="X5e2fc6240c8beff1a525410fd2be7db228f3c7c"/>
+    <w:bookmarkStart w:id="31" w:name="X6087830541218726607949defd38d27d91d0c4f"/>
     <w:p>
       <w:pPr>
         <w:pStyle w:val="Heading2"/>
       </w:pPr>
       <w:r>
-        <w:t xml:space="preserve">Program Explanation: Transfer Learning with ResNet-18 (transfer_learning_resnet18.py)</w:t>
+        <w:t xml:space="preserve">(b) Transfer learning with ResNet-18 (transfer_learning_resnet18.py)</w:t>
+      </w:r>
+    </w:p>
+    <w:p>
+      <w:pPr>
+        <w:pStyle w:val="SourceCode"/>
+      </w:pPr>
+      <w:r>
+        <w:rPr>
+          <w:rStyle w:val="VerbatimChar"/>
+        </w:rPr>
+        <w:t xml:space="preserve">model = torchvision.models.resnet18(pretrained=True)   # ImageNet weights</w:t>
+      </w:r>
+      <w:r>
+        <w:br/>
+      </w:r>
+      <w:r>
+        <w:br/>
+      </w:r>
+      <w:r>
+        <w:rPr>
+          <w:rStyle w:val="VerbatimChar"/>
+        </w:rPr>
+        <w:t xml:space="preserve"># Freeze the feature-extraction backbone</w:t>
+      </w:r>
+      <w:r>
+        <w:br/>
+      </w:r>
+      <w:r>
+        <w:rPr>
+          <w:rStyle w:val="VerbatimChar"/>
+        </w:rPr>
+        <w:t xml:space="preserve">for param in model.parameters():</w:t>
+      </w:r>
+      <w:r>
+        <w:br/>
+      </w:r>
+      <w:r>
+        <w:rPr>
+          <w:rStyle w:val="VerbatimChar"/>
+        </w:rPr>
+        <w:t xml:space="preserve">    param.requires_grad = False</w:t>
+      </w:r>
+      <w:r>
+        <w:br/>
+      </w:r>
+      <w:r>
+        <w:br/>
+      </w:r>
+      <w:r>
+        <w:rPr>
+          <w:rStyle w:val="VerbatimChar"/>
+        </w:rPr>
+        <w:t xml:space="preserve"># Replace the head: Linear(512 -&gt; 1000) becomes Linear(512 -&gt; num_classes)</w:t>
+      </w:r>
+      <w:r>
+        <w:br/>
+      </w:r>
+      <w:r>
+        <w:rPr>
+          <w:rStyle w:val="VerbatimChar"/>
+        </w:rPr>
+        <w:t xml:space="preserve">model.fc = nn.Linear(model.fc.in_features, num_classes)</w:t>
+      </w:r>
+      <w:r>
+        <w:br/>
+      </w:r>
+      <w:r>
+        <w:br/>
+      </w:r>
+      <w:r>
+        <w:rPr>
+          <w:rStyle w:val="VerbatimChar"/>
+        </w:rPr>
+        <w:t xml:space="preserve">optimizer = torch.optim.Adam(model.fc.parameters(), lr=1e-3)</w:t>
       </w:r>
     </w:p>
     <w:p>
@@ -8543,61 +9145,281 @@
         <w:pStyle w:val="FirstParagraph"/>
       </w:pPr>
       <w:r>
-        <w:t xml:space="preserve">This program takes a different approach to the same CIFAR-10 problem. Instead of training a network from scratch, it reuses ResNet-18, a much deeper network that has already been trained on ImageNet (about 1.2 million images across 1,000 classes). Because ResNet-18 has already learned general visual features like edges, textures and shapes, I can use its convolutional layers as a fixed feature extractor and only train a new final layer for the ten CIFAR-10 classes. The question this script answers is how well those pre-trained features carry over to a new dataset when almost none of the network is retrained.</w:t>
+        <w:t xml:space="preserve">Key points:</w:t>
       </w:r>
     </w:p>
     <w:p>
       <w:pPr>
-        <w:pStyle w:val="BodyText"/>
+        <w:numPr>
+          <w:ilvl w:val="0"/>
+          <w:numId w:val="1001"/>
+        </w:numPr>
+        <w:pStyle w:val="Compact"/>
       </w:pPr>
       <w:r>
-        <w:t xml:space="preserve">The model is built in build_model(). The assignment specifies torchvision.models.resnet18(pretrained=True), but the pretrained argument is deprecated in torchvision 0.13 and later, so I used the newer weights=ResNet18_Weights.IMAGENET1K_V1, which loads the same ImageNet weights. If an older version of torchvision is installed, the script falls back to pretrained=True. Next, a loop goes through every parameter in the model and sets requires_grad = False. This freezes the backbone, which means PyTorch does not compute gradients for those weights and the optimizer never changes them. Finally, I replaced the classification head. ResNet-18 ends with a fully connected layer, fc, that maps 512 features to the 1,000 ImageNet classes, so I swapped it for a new nn.Linear(512, 10). A newly created layer has requires_grad = True by default, so this new head is the only part of the network that trains:</w:t>
+        <w:rPr>
+          <w:bCs/>
+          <w:b/>
+        </w:rPr>
+        <w:t xml:space="preserve">Freezing.</w:t>
+      </w:r>
+      <w:r>
+        <w:t xml:space="preserve"> </w:t>
+      </w:r>
+      <w:r>
+        <w:t xml:space="preserve">Setting</w:t>
+      </w:r>
+      <w:r>
+        <w:t xml:space="preserve"> </w:t>
+      </w:r>
+      <w:r>
+        <w:rPr>
+          <w:rStyle w:val="VerbatimChar"/>
+        </w:rPr>
+        <w:t xml:space="preserve">requires_grad = False</w:t>
+      </w:r>
+      <w:r>
+        <w:t xml:space="preserve"> </w:t>
+      </w:r>
+      <w:r>
+        <w:t xml:space="preserve">stops gradients from</w:t>
+      </w:r>
+      <w:r>
+        <w:t xml:space="preserve"> </w:t>
+      </w:r>
+      <w:r>
+        <w:t xml:space="preserve">being computed for backbone weights, so they stay at their ImageNet</w:t>
+      </w:r>
+      <w:r>
+        <w:t xml:space="preserve"> </w:t>
+      </w:r>
+      <w:r>
+        <w:t xml:space="preserve">values. Backpropagation is cheaper and the pre-trained features are</w:t>
+      </w:r>
+      <w:r>
+        <w:t xml:space="preserve"> </w:t>
+      </w:r>
+      <w:r>
+        <w:t xml:space="preserve">preserved.</w:t>
       </w:r>
     </w:p>
     <w:p>
       <w:pPr>
-        <w:pStyle w:val="BodyText"/>
+        <w:numPr>
+          <w:ilvl w:val="0"/>
+          <w:numId w:val="1001"/>
+        </w:numPr>
+        <w:pStyle w:val="Compact"/>
       </w:pPr>
       <w:r>
-        <w:t xml:space="preserve">New head = 512·10 + 10 = 5,130 trainable parameters</w:t>
-      </w:r>
-      <w:r>
-        <w:br/>
-      </w:r>
-      <w:r>
-        <w:t xml:space="preserve">Backbone = 11,176,512 frozen parameters</w:t>
+        <w:rPr>
+          <w:bCs/>
+          <w:b/>
+        </w:rPr>
+        <w:t xml:space="preserve">New head.</w:t>
+      </w:r>
+      <w:r>
+        <w:t xml:space="preserve"> </w:t>
+      </w:r>
+      <w:r>
+        <w:t xml:space="preserve">A newly built</w:t>
+      </w:r>
+      <w:r>
+        <w:t xml:space="preserve"> </w:t>
+      </w:r>
+      <w:r>
+        <w:rPr>
+          <w:rStyle w:val="VerbatimChar"/>
+        </w:rPr>
+        <w:t xml:space="preserve">nn.Linear</w:t>
+      </w:r>
+      <w:r>
+        <w:t xml:space="preserve"> </w:t>
+      </w:r>
+      <w:r>
+        <w:t xml:space="preserve">has</w:t>
+      </w:r>
+      <w:r>
+        <w:t xml:space="preserve"> </w:t>
+      </w:r>
+      <w:r>
+        <w:rPr>
+          <w:rStyle w:val="VerbatimChar"/>
+        </w:rPr>
+        <w:t xml:space="preserve">requires_grad = True</w:t>
+      </w:r>
+      <w:r>
+        <w:t xml:space="preserve"> </w:t>
+      </w:r>
+      <w:r>
+        <w:t xml:space="preserve">by default, so it is the only part that trains: 512 × 10 + 10 =</w:t>
+      </w:r>
+      <w:r>
+        <w:t xml:space="preserve"> </w:t>
+      </w:r>
+      <w:r>
+        <w:t xml:space="preserve">5,130 parameters, versus about 11.18 million frozen.</w:t>
       </w:r>
     </w:p>
     <w:p>
       <w:pPr>
-        <w:pStyle w:val="BodyText"/>
+        <w:numPr>
+          <w:ilvl w:val="0"/>
+          <w:numId w:val="1001"/>
+        </w:numPr>
+        <w:pStyle w:val="Compact"/>
       </w:pPr>
       <w:r>
-        <w:t xml:space="preserve">That means only about 0.05% of the network’s weights are updated. The script prints both counts when it starts, which confirms that the freezing worked.</w:t>
+        <w:rPr>
+          <w:bCs/>
+          <w:b/>
+        </w:rPr>
+        <w:t xml:space="preserve">Optimizer.</w:t>
+      </w:r>
+      <w:r>
+        <w:t xml:space="preserve"> </w:t>
+      </w:r>
+      <w:r>
+        <w:t xml:space="preserve">Only</w:t>
+      </w:r>
+      <w:r>
+        <w:t xml:space="preserve"> </w:t>
+      </w:r>
+      <w:r>
+        <w:rPr>
+          <w:rStyle w:val="VerbatimChar"/>
+        </w:rPr>
+        <w:t xml:space="preserve">model.fc.parameters()</w:t>
+      </w:r>
+      <w:r>
+        <w:t xml:space="preserve"> </w:t>
+      </w:r>
+      <w:r>
+        <w:t xml:space="preserve">is passed to Adam.</w:t>
       </w:r>
     </w:p>
     <w:p>
       <w:pPr>
-        <w:pStyle w:val="BodyText"/>
+        <w:numPr>
+          <w:ilvl w:val="0"/>
+          <w:numId w:val="1001"/>
+        </w:numPr>
+        <w:pStyle w:val="Compact"/>
       </w:pPr>
       <w:r>
-        <w:t xml:space="preserve">The data pipeline in get_loaders() is different from the custom CNN in two ways. First, each 32 × 32 CIFAR-10 image is resized to 224 × 224, because that is the image size ResNet-18 was trained on, and its features work best at that scale. Second, the images are normalized with the ImageNet mean (0.485, 0.456, 0.406) and standard deviation (0.229, 0.224, 0.225) instead of the CIFAR-10 values. The frozen backbone expects its inputs to have the same statistics it saw during pre-training. The training images also get a RandomHorizontalFlip(), and the batch size is 64 because the larger 224 × 224 images use much more memory.</w:t>
+        <w:rPr>
+          <w:bCs/>
+          <w:b/>
+        </w:rPr>
+        <w:t xml:space="preserve">Preprocessing.</w:t>
+      </w:r>
+      <w:r>
+        <w:t xml:space="preserve"> </w:t>
+      </w:r>
+      <w:r>
+        <w:t xml:space="preserve">CIFAR-10 images are resized to 224 × 224 and</w:t>
+      </w:r>
+      <w:r>
+        <w:t xml:space="preserve"> </w:t>
+      </w:r>
+      <w:r>
+        <w:t xml:space="preserve">normalized with ImageNet mean (0.485, 0.456, 0.406) and std (0.229,</w:t>
+      </w:r>
+      <w:r>
+        <w:t xml:space="preserve"> </w:t>
+      </w:r>
+      <w:r>
+        <w:t xml:space="preserve">0.224, 0.225) to match what the backbone saw in pre-training.</w:t>
       </w:r>
     </w:p>
     <w:p>
       <w:pPr>
-        <w:pStyle w:val="BodyText"/>
+        <w:numPr>
+          <w:ilvl w:val="0"/>
+          <w:numId w:val="1001"/>
+        </w:numPr>
+        <w:pStyle w:val="Compact"/>
       </w:pPr>
       <w:r>
-        <w:t xml:space="preserve">Training and testing both run through one function, run_epoch(). When an optimizer is passed in, the model is put in training mode with gradients turned on, and each batch goes through the same steps as the custom CNN: forward pass, CrossEntropyLoss, zero_grad(), backward() and step(). When no optimizer is passed, the model is put in evaluation mode with gradients turned off, and the function only measures the loss and accuracy. I passed only model.fc.parameters() to the Adam optimizer (learning rate 0.001), which makes it clear that only the new head is being trained. Because only one linear layer is learning, 5 epochs is enough, and the final weights are saved to resnet18_transfer_cifar10.pth.</w:t>
+        <w:rPr>
+          <w:bCs/>
+          <w:b/>
+        </w:rPr>
+        <w:t xml:space="preserve">Version note.</w:t>
+      </w:r>
+      <w:r>
+        <w:t xml:space="preserve"> </w:t>
+      </w:r>
+      <w:r>
+        <w:rPr>
+          <w:rStyle w:val="VerbatimChar"/>
+        </w:rPr>
+        <w:t xml:space="preserve">pretrained=True</w:t>
+      </w:r>
+      <w:r>
+        <w:t xml:space="preserve"> </w:t>
+      </w:r>
+      <w:r>
+        <w:t xml:space="preserve">is deprecated in torchvision</w:t>
+      </w:r>
+      <w:r>
+        <w:t xml:space="preserve"> </w:t>
+      </w:r>
+      <w:r>
+        <w:t xml:space="preserve">0.13 and later; the script uses the equivalent</w:t>
+      </w:r>
+      <w:r>
+        <w:t xml:space="preserve"> </w:t>
+      </w:r>
+      <w:r>
+        <w:rPr>
+          <w:rStyle w:val="VerbatimChar"/>
+        </w:rPr>
+        <w:t xml:space="preserve">weights=ResNet18_Weights.IMAGENET1K_V1</w:t>
+      </w:r>
+      <w:r>
+        <w:t xml:space="preserve"> </w:t>
+      </w:r>
+      <w:r>
+        <w:t xml:space="preserve">and falls back to</w:t>
+      </w:r>
+      <w:r>
+        <w:t xml:space="preserve"> </w:t>
+      </w:r>
+      <w:r>
+        <w:rPr>
+          <w:rStyle w:val="VerbatimChar"/>
+        </w:rPr>
+        <w:t xml:space="preserve">pretrained=True</w:t>
+      </w:r>
+      <w:r>
+        <w:t xml:space="preserve"> </w:t>
+      </w:r>
+      <w:r>
+        <w:t xml:space="preserve">on older versions.</w:t>
       </w:r>
     </w:p>
     <w:p>
       <w:pPr>
-        <w:pStyle w:val="BodyText"/>
+        <w:pStyle w:val="FirstParagraph"/>
       </w:pPr>
       <w:r>
-        <w:t xml:space="preserve">The main difference between the two scripts is where the features come from. The custom CNN has 620,362 parameters and has to learn all of its features from random starting weights, so it needs more epochs. The transfer learning model has about 11.18 million parameters in total, but only 5,130 of them train. It starts from strong general features and only has to learn a linear classifier on top of them, so it usually reaches good accuracy in far fewer epochs. The trade-off is that each step costs more, because every image has to pass through the whole ResNet-18 at 224 × 224 resolution. If the head alone were not accurate enough, the next step would be to unfreeze the last residual block (model.layer4) and fine-tune it with a smaller learning rate, around 0.0001.</w:t>
+        <w:t xml:space="preserve">To fine-tune further, unfreeze the last block (</w:t>
+      </w:r>
+      <w:r>
+        <w:rPr>
+          <w:rStyle w:val="VerbatimChar"/>
+        </w:rPr>
+        <w:t xml:space="preserve">model.layer4</w:t>
+      </w:r>
+      <w:r>
+        <w:t xml:space="preserve">) after the</w:t>
+      </w:r>
+      <w:r>
+        <w:t xml:space="preserve"> </w:t>
+      </w:r>
+      <w:r>
+        <w:t xml:space="preserve">head converges and train it with a smaller learning rate (about 1e-4).</w:t>
       </w:r>
     </w:p>
     <w:bookmarkEnd w:id="31"/>
@@ -8711,8 +9533,87 @@
       </w:pPr>
     </w:lvl>
   </w:abstractNum>
+  <w:abstractNum w:abstractNumId="991">
+    <w:nsid w:val="A991"/>
+    <w:multiLevelType w:val="multilevel"/>
+    <w:lvl w:ilvl="0">
+      <w:numFmt w:val="bullet"/>
+      <w:lvlText w:val="•"/>
+      <w:lvlJc w:val="left"/>
+      <w:pPr>
+        <w:ind w:left="720" w:hanging="480"/>
+      </w:pPr>
+    </w:lvl>
+    <w:lvl w:ilvl="1">
+      <w:numFmt w:val="bullet"/>
+      <w:lvlText w:val="–"/>
+      <w:lvlJc w:val="left"/>
+      <w:pPr>
+        <w:ind w:left="1440" w:hanging="480"/>
+      </w:pPr>
+    </w:lvl>
+    <w:lvl w:ilvl="2">
+      <w:numFmt w:val="bullet"/>
+      <w:lvlText w:val="•"/>
+      <w:lvlJc w:val="left"/>
+      <w:pPr>
+        <w:ind w:left="2160" w:hanging="480"/>
+      </w:pPr>
+    </w:lvl>
+    <w:lvl w:ilvl="3">
+      <w:numFmt w:val="bullet"/>
+      <w:lvlText w:val="–"/>
+      <w:lvlJc w:val="left"/>
+      <w:pPr>
+        <w:ind w:left="2880" w:hanging="480"/>
+      </w:pPr>
+    </w:lvl>
+    <w:lvl w:ilvl="4">
+      <w:numFmt w:val="bullet"/>
+      <w:lvlText w:val="•"/>
+      <w:lvlJc w:val="left"/>
+      <w:pPr>
+        <w:ind w:left="3600" w:hanging="480"/>
+      </w:pPr>
+    </w:lvl>
+    <w:lvl w:ilvl="5">
+      <w:numFmt w:val="bullet"/>
+      <w:lvlText w:val="–"/>
+      <w:lvlJc w:val="left"/>
+      <w:pPr>
+        <w:ind w:left="4320" w:hanging="480"/>
+      </w:pPr>
+    </w:lvl>
+    <w:lvl w:ilvl="6">
+      <w:numFmt w:val="bullet"/>
+      <w:lvlText w:val="•"/>
+      <w:lvlJc w:val="left"/>
+      <w:pPr>
+        <w:ind w:left="5040" w:hanging="480"/>
+      </w:pPr>
+    </w:lvl>
+    <w:lvl w:ilvl="7">
+      <w:numFmt w:val="bullet"/>
+      <w:lvlText w:val="–"/>
+      <w:lvlJc w:val="left"/>
+      <w:pPr>
+        <w:ind w:left="5760" w:hanging="480"/>
+      </w:pPr>
+    </w:lvl>
+    <w:lvl w:ilvl="8">
+      <w:numFmt w:val="bullet"/>
+      <w:lvlText w:val="•"/>
+      <w:lvlJc w:val="left"/>
+      <w:pPr>
+        <w:ind w:left="6480" w:hanging="480"/>
+      </w:pPr>
+    </w:lvl>
+  </w:abstractNum>
   <w:num w:numId="1000">
     <w:abstractNumId w:val="990"/>
+  </w:num>
+  <w:num w:numId="1001">
+    <w:abstractNumId w:val="991"/>
   </w:num>
 </w:numbering>
 </file>

</xml_diff>